<commit_message>
updated assets + bullet speed + report
</commit_message>
<xml_diff>
--- a/Project Report.docx
+++ b/Project Report.docx
@@ -1,6 +1,6 @@
 
 <file path=word/document.xml><?xml version="1.0" encoding="utf-8"?>
-<w:document xmlns:wpc="http://schemas.microsoft.com/office/word/2010/wordprocessingCanvas" xmlns:cx="http://schemas.microsoft.com/office/drawing/2014/chartex" xmlns:cx1="http://schemas.microsoft.com/office/drawing/2015/9/8/chartex" xmlns:cx2="http://schemas.microsoft.com/office/drawing/2015/10/21/chartex" xmlns:cx3="http://schemas.microsoft.com/office/drawing/2016/5/9/chartex" xmlns:cx4="http://schemas.microsoft.com/office/drawing/2016/5/10/chartex" xmlns:cx5="http://schemas.microsoft.com/office/drawing/2016/5/11/chartex" xmlns:cx6="http://schemas.microsoft.com/office/drawing/2016/5/12/chartex" xmlns:cx7="http://schemas.microsoft.com/office/drawing/2016/5/13/chartex" xmlns:cx8="http://schemas.microsoft.com/office/drawing/2016/5/14/chartex" xmlns:mc="http://schemas.openxmlformats.org/markup-compatibility/2006" xmlns:aink="http://schemas.microsoft.com/office/drawing/2016/ink" xmlns:am3d="http://schemas.microsoft.com/office/drawing/2017/model3d" xmlns:o="urn:schemas-microsoft-com:office:office" xmlns:oel="http://schemas.microsoft.com/office/2019/extlst" xmlns:r="http://schemas.openxmlformats.org/officeDocument/2006/relationships" xmlns:m="http://schemas.openxmlformats.org/officeDocument/2006/math" xmlns:v="urn:schemas-microsoft-com:vml" xmlns:wp14="http://schemas.microsoft.com/office/word/2010/wordprocessingDrawing" xmlns:wp="http://schemas.openxmlformats.org/drawingml/2006/wordprocessingDrawing" xmlns:w10="urn:schemas-microsoft-com:office:word" xmlns:w="http://schemas.openxmlformats.org/wordprocessingml/2006/main" xmlns:w14="http://schemas.microsoft.com/office/word/2010/wordml" xmlns:w15="http://schemas.microsoft.com/office/word/2012/wordml" xmlns:w16cex="http://schemas.microsoft.com/office/word/2018/wordml/cex" xmlns:w16cid="http://schemas.microsoft.com/office/word/2016/wordml/cid" xmlns:w16="http://schemas.microsoft.com/office/word/2018/wordml" xmlns:w16du="http://schemas.microsoft.com/office/word/2023/wordml/word16du" xmlns:w16sdtdh="http://schemas.microsoft.com/office/word/2020/wordml/sdtdatahash" xmlns:w16se="http://schemas.microsoft.com/office/word/2015/wordml/symex" xmlns:wpg="http://schemas.microsoft.com/office/word/2010/wordprocessingGroup" xmlns:wpi="http://schemas.microsoft.com/office/word/2010/wordprocessingInk" xmlns:wne="http://schemas.microsoft.com/office/word/2006/wordml" xmlns:wps="http://schemas.microsoft.com/office/word/2010/wordprocessingShape" mc:Ignorable="w14 w15 w16se w16cid w16 w16cex w16sdtdh w16du wp14">
+<w:document xmlns:wpc="http://schemas.microsoft.com/office/word/2010/wordprocessingCanvas" xmlns:cx="http://schemas.microsoft.com/office/drawing/2014/chartex" xmlns:cx1="http://schemas.microsoft.com/office/drawing/2015/9/8/chartex" xmlns:cx2="http://schemas.microsoft.com/office/drawing/2015/10/21/chartex" xmlns:cx3="http://schemas.microsoft.com/office/drawing/2016/5/9/chartex" xmlns:cx4="http://schemas.microsoft.com/office/drawing/2016/5/10/chartex" xmlns:cx5="http://schemas.microsoft.com/office/drawing/2016/5/11/chartex" xmlns:cx6="http://schemas.microsoft.com/office/drawing/2016/5/12/chartex" xmlns:cx7="http://schemas.microsoft.com/office/drawing/2016/5/13/chartex" xmlns:cx8="http://schemas.microsoft.com/office/drawing/2016/5/14/chartex" xmlns:mc="http://schemas.openxmlformats.org/markup-compatibility/2006" xmlns:aink="http://schemas.microsoft.com/office/drawing/2016/ink" xmlns:am3d="http://schemas.microsoft.com/office/drawing/2017/model3d" xmlns:o="urn:schemas-microsoft-com:office:office" xmlns:oel="http://schemas.microsoft.com/office/2019/extlst" xmlns:r="http://schemas.openxmlformats.org/officeDocument/2006/relationships" xmlns:m="http://schemas.openxmlformats.org/officeDocument/2006/math" xmlns:v="urn:schemas-microsoft-com:vml" xmlns:wp14="http://schemas.microsoft.com/office/word/2010/wordprocessingDrawing" xmlns:wp="http://schemas.openxmlformats.org/drawingml/2006/wordprocessingDrawing" xmlns:w10="urn:schemas-microsoft-com:office:word" xmlns:w="http://schemas.openxmlformats.org/wordprocessingml/2006/main" xmlns:w14="http://schemas.microsoft.com/office/word/2010/wordml" xmlns:w15="http://schemas.microsoft.com/office/word/2012/wordml" xmlns:w16cex="http://schemas.microsoft.com/office/word/2018/wordml/cex" xmlns:w16cid="http://schemas.microsoft.com/office/word/2016/wordml/cid" xmlns:w16="http://schemas.microsoft.com/office/word/2018/wordml" xmlns:w16du="http://schemas.microsoft.com/office/word/2023/wordml/word16du" xmlns:w16sdtdh="http://schemas.microsoft.com/office/word/2020/wordml/sdtdatahash" xmlns:w16sdtfl="http://schemas.microsoft.com/office/word/2024/wordml/sdtformatlock" xmlns:w16se="http://schemas.microsoft.com/office/word/2015/wordml/symex" xmlns:wpg="http://schemas.microsoft.com/office/word/2010/wordprocessingGroup" xmlns:wpi="http://schemas.microsoft.com/office/word/2010/wordprocessingInk" xmlns:wne="http://schemas.microsoft.com/office/word/2006/wordml" xmlns:wps="http://schemas.microsoft.com/office/word/2010/wordprocessingShape" mc:Ignorable="w14 w15 w16se w16cid w16 w16cex w16sdtdh w16sdtfl w16du wp14">
   <w:body>
     <w:p>
       <w:pPr>
@@ -100,7 +100,7 @@
       <w:hyperlink r:id="rId5" w:history="1">
         <w:r>
           <w:rPr>
-            <w:rStyle w:val="Hyperlink"/>
+            <w:rStyle w:val="-"/>
             <w:b/>
             <w:bCs/>
           </w:rPr>
@@ -670,10 +670,6 @@
           <w:ilvl w:val="0"/>
           <w:numId w:val="22"/>
         </w:numPr>
-        <w:rPr>
-          <w:b/>
-          <w:bCs/>
-        </w:rPr>
       </w:pPr>
       <w:r>
         <w:rPr>
@@ -683,7 +679,7 @@
         <w:t xml:space="preserve">Faidon Azariadis: </w:t>
       </w:r>
       <w:r>
-        <w:t>Designed the user interface, handled sound effects, and managed game states (pause, game over, level complete).</w:t>
+        <w:t>Designed the entire user interface and game visuals, including all images and sound assets. Developed and implemented all menus (pause, winning, game over). Created and managed the map screen, including the progression system that allows players to access the last unlocked level. Implemented the lives system and the spawning of random hearts.</w:t>
       </w:r>
     </w:p>
     <w:p>
@@ -705,23 +701,30 @@
         <w:t xml:space="preserve">Panos Moschos: </w:t>
       </w:r>
       <w:r>
-        <w:t>Implemented the core game logic, player and enemy interactions, and level progression.</w:t>
-      </w:r>
-    </w:p>
-    <w:p>
-      <w:pPr>
-        <w:rPr>
-          <w:b/>
-          <w:bCs/>
-        </w:rPr>
-      </w:pPr>
-      <w:r>
-        <w:rPr>
-          <w:b/>
-          <w:bCs/>
-        </w:rPr>
-        <w:pict w14:anchorId="5501DB23">
-          <v:rect id="_x0000_i1028" style="width:0;height:1.5pt" o:hralign="center" o:hrstd="t" o:hr="t" fillcolor="#a0a0a0" stroked="f"/>
+        <w:t>Implemented player and enemy interactio</w:t>
+      </w:r>
+      <w:r>
+        <w:t>n</w:t>
+      </w:r>
+      <w:r>
+        <w:t>s.</w:t>
+      </w:r>
+    </w:p>
+    <w:p>
+      <w:pPr>
+        <w:rPr>
+          <w:b/>
+          <w:bCs/>
+        </w:rPr>
+      </w:pPr>
+      <w:r>
+        <w:rPr>
+          <w:b/>
+          <w:bCs/>
+        </w:rPr>
+        <w:lastRenderedPageBreak/>
+        <w:pict w14:anchorId="5BAD88A4">
+          <v:rect id="_x0000_i1042" style="width:0;height:1.5pt" o:hralign="center" o:hrstd="t" o:hr="t" fillcolor="#a0a0a0" stroked="f"/>
         </w:pict>
       </w:r>
     </w:p>
@@ -741,7 +744,6 @@
           <w:sz w:val="36"/>
           <w:szCs w:val="36"/>
         </w:rPr>
-        <w:lastRenderedPageBreak/>
         <w:t>High-Level Documentation</w:t>
       </w:r>
     </w:p>
@@ -750,16 +752,16 @@
         <w:rPr>
           <w:b/>
           <w:bCs/>
-          <w:sz w:val="28"/>
-          <w:szCs w:val="28"/>
-        </w:rPr>
-      </w:pPr>
-      <w:r>
-        <w:rPr>
-          <w:b/>
-          <w:bCs/>
-          <w:sz w:val="28"/>
-          <w:szCs w:val="28"/>
+          <w:sz w:val="32"/>
+          <w:szCs w:val="32"/>
+        </w:rPr>
+      </w:pPr>
+      <w:r>
+        <w:rPr>
+          <w:b/>
+          <w:bCs/>
+          <w:sz w:val="32"/>
+          <w:szCs w:val="32"/>
         </w:rPr>
         <w:t>Game Structure</w:t>
       </w:r>
@@ -768,7 +770,7 @@
       <w:pPr>
         <w:numPr>
           <w:ilvl w:val="0"/>
-          <w:numId w:val="23"/>
+          <w:numId w:val="31"/>
         </w:numPr>
       </w:pPr>
       <w:r>
@@ -776,128 +778,547 @@
           <w:b/>
           <w:bCs/>
         </w:rPr>
-        <w:t>Player</w:t>
-      </w:r>
-      <w:r>
-        <w:t>: Manages player movement, shooting, and power-ups.</w:t>
+        <w:t xml:space="preserve">Player: </w:t>
+      </w:r>
+      <w:r>
+        <w:t>Manages player movement, shooting, and power-ups.</w:t>
+      </w:r>
+    </w:p>
+    <w:p>
+      <w:pPr>
+        <w:numPr>
+          <w:ilvl w:val="1"/>
+          <w:numId w:val="31"/>
+        </w:numPr>
+      </w:pPr>
+      <w:r>
+        <w:rPr>
+          <w:b/>
+          <w:bCs/>
+        </w:rPr>
+        <w:t>File</w:t>
+      </w:r>
+      <w:r>
+        <w:t>: play</w:t>
+      </w:r>
+      <w:r>
+        <w:t>e</w:t>
+      </w:r>
+      <w:r>
+        <w:t>r.js</w:t>
+      </w:r>
+    </w:p>
+    <w:p>
+      <w:pPr>
+        <w:numPr>
+          <w:ilvl w:val="1"/>
+          <w:numId w:val="31"/>
+        </w:numPr>
+      </w:pPr>
+      <w:r>
+        <w:rPr>
+          <w:b/>
+          <w:bCs/>
+        </w:rPr>
+        <w:t>Description</w:t>
+      </w:r>
+      <w:r>
+        <w:t>: The Player class handles the player's position, movement, shooting mechanics, and power-up effects. It also includes methods to display the player and manage the power-up duration.</w:t>
       </w:r>
     </w:p>
     <w:p>
       <w:pPr>
         <w:numPr>
           <w:ilvl w:val="0"/>
-          <w:numId w:val="23"/>
+          <w:numId w:val="31"/>
         </w:numPr>
-      </w:pPr>
-      <w:r>
-        <w:rPr>
-          <w:b/>
-          <w:bCs/>
-        </w:rPr>
-        <w:t>Enemies</w:t>
-      </w:r>
-      <w:r>
-        <w:t>: Different types of enemies with varying health and speed.</w:t>
+        <w:rPr>
+          <w:b/>
+          <w:bCs/>
+        </w:rPr>
+      </w:pPr>
+      <w:r>
+        <w:rPr>
+          <w:b/>
+          <w:bCs/>
+        </w:rPr>
+        <w:t xml:space="preserve">Enemies: </w:t>
+      </w:r>
+      <w:r>
+        <w:t>Different types of enemies with varying health and speed.</w:t>
+      </w:r>
+    </w:p>
+    <w:p>
+      <w:pPr>
+        <w:numPr>
+          <w:ilvl w:val="1"/>
+          <w:numId w:val="31"/>
+        </w:numPr>
+        <w:rPr>
+          <w:b/>
+          <w:bCs/>
+        </w:rPr>
+      </w:pPr>
+      <w:r>
+        <w:rPr>
+          <w:b/>
+          <w:bCs/>
+        </w:rPr>
+        <w:t>File: </w:t>
+      </w:r>
+      <w:r>
+        <w:t>enemy.js</w:t>
+      </w:r>
+    </w:p>
+    <w:p>
+      <w:pPr>
+        <w:numPr>
+          <w:ilvl w:val="1"/>
+          <w:numId w:val="31"/>
+        </w:numPr>
+        <w:rPr>
+          <w:b/>
+          <w:bCs/>
+        </w:rPr>
+      </w:pPr>
+      <w:r>
+        <w:rPr>
+          <w:b/>
+          <w:bCs/>
+        </w:rPr>
+        <w:t xml:space="preserve">Description: </w:t>
+      </w:r>
+      <w:r>
+        <w:t>The Enemy class and its subclasses (MediumEnemy and StrongEnemy) manage enemy behavior, including movement, health, and collision detection with bullets. Each subclass has different attributes for size, speed, and health.</w:t>
       </w:r>
     </w:p>
     <w:p>
       <w:pPr>
         <w:numPr>
           <w:ilvl w:val="0"/>
-          <w:numId w:val="23"/>
+          <w:numId w:val="31"/>
         </w:numPr>
-      </w:pPr>
-      <w:r>
-        <w:rPr>
-          <w:b/>
-          <w:bCs/>
-        </w:rPr>
-        <w:t>Bullets</w:t>
-      </w:r>
-      <w:r>
-        <w:t>: Handles bullet movement and collision detection.</w:t>
+        <w:rPr>
+          <w:b/>
+          <w:bCs/>
+        </w:rPr>
+      </w:pPr>
+      <w:r>
+        <w:rPr>
+          <w:b/>
+          <w:bCs/>
+        </w:rPr>
+        <w:t>Bullets: Handles bullet movement and collision detection.</w:t>
+      </w:r>
+    </w:p>
+    <w:p>
+      <w:pPr>
+        <w:numPr>
+          <w:ilvl w:val="1"/>
+          <w:numId w:val="31"/>
+        </w:numPr>
+      </w:pPr>
+      <w:r>
+        <w:rPr>
+          <w:b/>
+          <w:bCs/>
+        </w:rPr>
+        <w:t>File</w:t>
+      </w:r>
+      <w:r>
+        <w:t>: bullet.js</w:t>
+      </w:r>
+    </w:p>
+    <w:p>
+      <w:pPr>
+        <w:numPr>
+          <w:ilvl w:val="1"/>
+          <w:numId w:val="31"/>
+        </w:numPr>
+      </w:pPr>
+      <w:r>
+        <w:rPr>
+          <w:b/>
+          <w:bCs/>
+        </w:rPr>
+        <w:t xml:space="preserve">Description: </w:t>
+      </w:r>
+      <w:r>
+        <w:t>The Bullet class manages the position, movement, and collision detection of bullets fired by the player. It also handles the visual representation of bullets and explosions.</w:t>
       </w:r>
     </w:p>
     <w:p>
       <w:pPr>
         <w:numPr>
           <w:ilvl w:val="0"/>
-          <w:numId w:val="23"/>
+          <w:numId w:val="31"/>
         </w:numPr>
-      </w:pPr>
-      <w:r>
-        <w:rPr>
-          <w:b/>
-          <w:bCs/>
-        </w:rPr>
-        <w:t>Power-Ups</w:t>
-      </w:r>
-      <w:r>
-        <w:t>: Provides temporary enhancements to the player.</w:t>
+        <w:rPr>
+          <w:b/>
+          <w:bCs/>
+        </w:rPr>
+      </w:pPr>
+      <w:r>
+        <w:rPr>
+          <w:b/>
+          <w:bCs/>
+        </w:rPr>
+        <w:t>Power-Ups: Provides temporary enhancements to the player.</w:t>
+      </w:r>
+    </w:p>
+    <w:p>
+      <w:pPr>
+        <w:numPr>
+          <w:ilvl w:val="1"/>
+          <w:numId w:val="31"/>
+        </w:numPr>
+        <w:rPr>
+          <w:b/>
+          <w:bCs/>
+        </w:rPr>
+      </w:pPr>
+      <w:r>
+        <w:rPr>
+          <w:b/>
+          <w:bCs/>
+        </w:rPr>
+        <w:t>File</w:t>
+      </w:r>
+      <w:r>
+        <w:t>: powerup.js</w:t>
+      </w:r>
+    </w:p>
+    <w:p>
+      <w:pPr>
+        <w:numPr>
+          <w:ilvl w:val="1"/>
+          <w:numId w:val="31"/>
+        </w:numPr>
+        <w:rPr>
+          <w:b/>
+          <w:bCs/>
+        </w:rPr>
+      </w:pPr>
+      <w:r>
+        <w:rPr>
+          <w:b/>
+          <w:bCs/>
+        </w:rPr>
+        <w:t xml:space="preserve">Description: </w:t>
+      </w:r>
+      <w:r>
+        <w:t>The PowerUp class manages the position, movement, and type of power-ups. It includes methods to display power-ups and check if they are collected by the player.</w:t>
       </w:r>
     </w:p>
     <w:p>
       <w:pPr>
         <w:numPr>
           <w:ilvl w:val="0"/>
-          <w:numId w:val="23"/>
+          <w:numId w:val="31"/>
         </w:numPr>
-      </w:pPr>
-      <w:r>
-        <w:rPr>
-          <w:b/>
-          <w:bCs/>
-        </w:rPr>
-        <w:t>Hearts</w:t>
-      </w:r>
-      <w:r>
-        <w:t>: Increases player's lives when collected.</w:t>
+        <w:rPr>
+          <w:b/>
+          <w:bCs/>
+        </w:rPr>
+      </w:pPr>
+      <w:r>
+        <w:rPr>
+          <w:b/>
+          <w:bCs/>
+        </w:rPr>
+        <w:t>Hearts: Increases player's lives when collected.</w:t>
+      </w:r>
+    </w:p>
+    <w:p>
+      <w:pPr>
+        <w:numPr>
+          <w:ilvl w:val="1"/>
+          <w:numId w:val="31"/>
+        </w:numPr>
+        <w:rPr>
+          <w:b/>
+          <w:bCs/>
+        </w:rPr>
+      </w:pPr>
+      <w:r>
+        <w:rPr>
+          <w:b/>
+          <w:bCs/>
+        </w:rPr>
+        <w:t>File: </w:t>
+      </w:r>
+      <w:r>
+        <w:t>heart.js</w:t>
+      </w:r>
+    </w:p>
+    <w:p>
+      <w:pPr>
+        <w:numPr>
+          <w:ilvl w:val="1"/>
+          <w:numId w:val="31"/>
+        </w:numPr>
+      </w:pPr>
+      <w:r>
+        <w:rPr>
+          <w:b/>
+          <w:bCs/>
+        </w:rPr>
+        <w:lastRenderedPageBreak/>
+        <w:t xml:space="preserve">Description: </w:t>
+      </w:r>
+      <w:r>
+        <w:t>The Heart class manages the position, movement, and collection of hearts. When collected by the player, hearts increase the player's lives.</w:t>
       </w:r>
     </w:p>
     <w:p>
       <w:pPr>
         <w:numPr>
           <w:ilvl w:val="0"/>
-          <w:numId w:val="23"/>
+          <w:numId w:val="31"/>
         </w:numPr>
-      </w:pPr>
-      <w:r>
-        <w:rPr>
-          <w:b/>
-          <w:bCs/>
-        </w:rPr>
-        <w:t>Stars</w:t>
-      </w:r>
-      <w:r>
-        <w:t>: Background elements for visual effect.</w:t>
+        <w:rPr>
+          <w:b/>
+          <w:bCs/>
+        </w:rPr>
+      </w:pPr>
+      <w:r>
+        <w:rPr>
+          <w:b/>
+          <w:bCs/>
+        </w:rPr>
+        <w:t xml:space="preserve">Stars: Background elements for visual </w:t>
+      </w:r>
+      <w:proofErr w:type="gramStart"/>
+      <w:r>
+        <w:rPr>
+          <w:b/>
+          <w:bCs/>
+        </w:rPr>
+        <w:t>effect</w:t>
+      </w:r>
+      <w:proofErr w:type="gramEnd"/>
+      <w:r>
+        <w:rPr>
+          <w:b/>
+          <w:bCs/>
+        </w:rPr>
+        <w:t>.</w:t>
+      </w:r>
+    </w:p>
+    <w:p>
+      <w:pPr>
+        <w:numPr>
+          <w:ilvl w:val="1"/>
+          <w:numId w:val="31"/>
+        </w:numPr>
+      </w:pPr>
+      <w:r>
+        <w:rPr>
+          <w:b/>
+          <w:bCs/>
+        </w:rPr>
+        <w:t>File: </w:t>
+      </w:r>
+      <w:r>
+        <w:t>star.js</w:t>
+      </w:r>
+    </w:p>
+    <w:p>
+      <w:pPr>
+        <w:numPr>
+          <w:ilvl w:val="1"/>
+          <w:numId w:val="31"/>
+        </w:numPr>
+      </w:pPr>
+      <w:r>
+        <w:rPr>
+          <w:b/>
+          <w:bCs/>
+        </w:rPr>
+        <w:t xml:space="preserve">Description: </w:t>
+      </w:r>
+      <w:r>
+        <w:t xml:space="preserve">The Star class creates and manages star objects that move in the background, providing a visual effect of a moving </w:t>
+      </w:r>
+      <w:proofErr w:type="gramStart"/>
+      <w:r>
+        <w:t>starfield</w:t>
+      </w:r>
+      <w:proofErr w:type="gramEnd"/>
+      <w:r>
+        <w:t>.</w:t>
       </w:r>
     </w:p>
     <w:p>
       <w:pPr>
         <w:numPr>
           <w:ilvl w:val="0"/>
-          <w:numId w:val="23"/>
+          <w:numId w:val="31"/>
         </w:numPr>
-      </w:pPr>
-      <w:r>
-        <w:rPr>
-          <w:b/>
-          <w:bCs/>
-        </w:rPr>
-        <w:t>Game</w:t>
-      </w:r>
-      <w:r>
-        <w:t xml:space="preserve"> </w:t>
-      </w:r>
-      <w:r>
-        <w:rPr>
-          <w:b/>
-          <w:bCs/>
-        </w:rPr>
-        <w:t>States</w:t>
-      </w:r>
-      <w:r>
-        <w:t>: Manages different game states (battle, map, pause, game over, level complete).</w:t>
+        <w:rPr>
+          <w:b/>
+          <w:bCs/>
+        </w:rPr>
+      </w:pPr>
+      <w:r>
+        <w:rPr>
+          <w:b/>
+          <w:bCs/>
+        </w:rPr>
+        <w:t>Game States: Manages different game states (battle, map, pause, game over, level complete).</w:t>
+      </w:r>
+    </w:p>
+    <w:p>
+      <w:pPr>
+        <w:numPr>
+          <w:ilvl w:val="1"/>
+          <w:numId w:val="31"/>
+        </w:numPr>
+      </w:pPr>
+      <w:r>
+        <w:rPr>
+          <w:b/>
+          <w:bCs/>
+        </w:rPr>
+        <w:t>Files: </w:t>
+      </w:r>
+      <w:r>
+        <w:t>battle.js, map.js, sketch.js</w:t>
+      </w:r>
+    </w:p>
+    <w:p>
+      <w:pPr>
+        <w:numPr>
+          <w:ilvl w:val="1"/>
+          <w:numId w:val="31"/>
+        </w:numPr>
+        <w:rPr>
+          <w:b/>
+          <w:bCs/>
+        </w:rPr>
+      </w:pPr>
+      <w:r>
+        <w:rPr>
+          <w:b/>
+          <w:bCs/>
+        </w:rPr>
+        <w:t>Description:</w:t>
+      </w:r>
+    </w:p>
+    <w:p>
+      <w:pPr>
+        <w:numPr>
+          <w:ilvl w:val="2"/>
+          <w:numId w:val="31"/>
+        </w:numPr>
+      </w:pPr>
+      <w:r>
+        <w:rPr>
+          <w:b/>
+          <w:bCs/>
+        </w:rPr>
+        <w:t>battle.js</w:t>
+      </w:r>
+      <w:r>
+        <w:t>:</w:t>
+      </w:r>
+      <w:r>
+        <w:t xml:space="preserve"> Manages the main gameplay loop, including spawning enemies, handling player input, updating game objects, and checking for game over or level completion.</w:t>
+      </w:r>
+    </w:p>
+    <w:p>
+      <w:pPr>
+        <w:numPr>
+          <w:ilvl w:val="2"/>
+          <w:numId w:val="31"/>
+        </w:numPr>
+      </w:pPr>
+      <w:r>
+        <w:rPr>
+          <w:b/>
+          <w:bCs/>
+        </w:rPr>
+        <w:t>map.js</w:t>
+      </w:r>
+      <w:r>
+        <w:t>: Manages the map screen where players can select levels to play.</w:t>
+      </w:r>
+    </w:p>
+    <w:p>
+      <w:pPr>
+        <w:numPr>
+          <w:ilvl w:val="2"/>
+          <w:numId w:val="31"/>
+        </w:numPr>
+      </w:pPr>
+      <w:r>
+        <w:rPr>
+          <w:b/>
+          <w:bCs/>
+        </w:rPr>
+        <w:t>sketch.js</w:t>
+      </w:r>
+      <w:r>
+        <w:t>: Initializes the game, loads assets, and handles the main draw loop to switch between different game states (map, battle, pause, game over, level complete).</w:t>
+      </w:r>
+    </w:p>
+    <w:p>
+      <w:pPr>
+        <w:numPr>
+          <w:ilvl w:val="0"/>
+          <w:numId w:val="31"/>
+        </w:numPr>
+        <w:rPr>
+          <w:b/>
+          <w:bCs/>
+        </w:rPr>
+      </w:pPr>
+      <w:r>
+        <w:rPr>
+          <w:b/>
+          <w:bCs/>
+        </w:rPr>
+        <w:t>Score and Level Display: Displays the player's score, current level, and lives.</w:t>
+      </w:r>
+    </w:p>
+    <w:p>
+      <w:pPr>
+        <w:numPr>
+          <w:ilvl w:val="1"/>
+          <w:numId w:val="31"/>
+        </w:numPr>
+      </w:pPr>
+      <w:r>
+        <w:rPr>
+          <w:b/>
+          <w:bCs/>
+        </w:rPr>
+        <w:t>File: </w:t>
+      </w:r>
+      <w:r>
+        <w:t>score.js</w:t>
+      </w:r>
+    </w:p>
+    <w:p>
+      <w:pPr>
+        <w:numPr>
+          <w:ilvl w:val="1"/>
+          <w:numId w:val="31"/>
+        </w:numPr>
+        <w:rPr>
+          <w:b/>
+          <w:bCs/>
+        </w:rPr>
+      </w:pPr>
+      <w:r>
+        <w:rPr>
+          <w:b/>
+          <w:bCs/>
+        </w:rPr>
+        <w:t xml:space="preserve">Description: </w:t>
+      </w:r>
+      <w:r>
+        <w:t>Functions to display the player's score, current level, and remaining lives on the screen.</w:t>
       </w:r>
     </w:p>
     <w:p>
@@ -995,6 +1416,7 @@
           <w:b/>
           <w:bCs/>
         </w:rPr>
+        <w:lastRenderedPageBreak/>
         <w:t>togglePause():</w:t>
       </w:r>
       <w:r>
@@ -1123,7 +1545,7 @@
       <w:hyperlink r:id="rId6" w:history="1">
         <w:r>
           <w:rPr>
-            <w:rStyle w:val="Hyperlink"/>
+            <w:rStyle w:val="-"/>
             <w:b/>
             <w:bCs/>
           </w:rPr>
@@ -1145,7 +1567,7 @@
       <w:hyperlink r:id="rId7" w:history="1">
         <w:r>
           <w:rPr>
-            <w:rStyle w:val="Hyperlink"/>
+            <w:rStyle w:val="-"/>
             <w:b/>
             <w:bCs/>
           </w:rPr>
@@ -1155,7 +1577,7 @@
     </w:p>
     <w:p>
       <w:pPr>
-        <w:pStyle w:val="NormalWeb"/>
+        <w:pStyle w:val="Web"/>
         <w:numPr>
           <w:ilvl w:val="0"/>
           <w:numId w:val="25"/>
@@ -1169,7 +1591,7 @@
       <w:hyperlink r:id="rId8" w:anchor="/libraries/p5.sound" w:history="1">
         <w:r>
           <w:rPr>
-            <w:rStyle w:val="Hyperlink"/>
+            <w:rStyle w:val="-"/>
             <w:rFonts w:asciiTheme="minorHAnsi" w:hAnsiTheme="minorHAnsi"/>
             <w:b/>
             <w:bCs/>
@@ -1368,29 +1790,29 @@
       <w:pPr>
         <w:numPr>
           <w:ilvl w:val="0"/>
-          <w:numId w:val="28"/>
+          <w:numId w:val="32"/>
         </w:numPr>
-        <w:rPr>
-          <w:b/>
-          <w:bCs/>
-        </w:rPr>
-      </w:pPr>
-      <w:r>
-        <w:rPr>
-          <w:b/>
-          <w:bCs/>
-        </w:rPr>
-        <w:t xml:space="preserve">Issue: </w:t>
-      </w:r>
-      <w:r>
-        <w:t>Managing multiple sound effects and background music.</w:t>
+      </w:pPr>
+      <w:r>
+        <w:rPr>
+          <w:b/>
+          <w:bCs/>
+        </w:rPr>
+        <w:t>Issue</w:t>
+      </w:r>
+      <w:r>
+        <w:t xml:space="preserve">: In the winning screen, I wanted to combine the winning sound and then play the menu sound after a delay. The problem arose when the player </w:t>
+      </w:r>
+      <w:r>
+        <w:lastRenderedPageBreak/>
+        <w:t>went back to the map before the menu sound played; because of the delay, the menu sound would accidentally play at the map screen.</w:t>
       </w:r>
     </w:p>
     <w:p>
       <w:pPr>
         <w:numPr>
           <w:ilvl w:val="0"/>
-          <w:numId w:val="28"/>
+          <w:numId w:val="32"/>
         </w:numPr>
       </w:pPr>
       <w:r>
@@ -1398,10 +1820,10 @@
           <w:b/>
           <w:bCs/>
         </w:rPr>
-        <w:t xml:space="preserve">Resolution: </w:t>
-      </w:r>
-      <w:r>
-        <w:t>Used the p5.sound library to load, play, and control sound effects and background music.</w:t>
+        <w:t>Resolution:</w:t>
+      </w:r>
+      <w:r>
+        <w:t xml:space="preserve"> To avoid using a delay on the pause menu, I merged the winning sound and menu sound into one continuous sound clip, ensuring both sounds played seamlessly without causing issues when transitioning between screens.</w:t>
       </w:r>
     </w:p>
     <w:p>
@@ -1504,7 +1926,7 @@
     </w:p>
     <w:p>
       <w:pPr>
-        <w:pStyle w:val="ListParagraph"/>
+        <w:pStyle w:val="a6"/>
         <w:numPr>
           <w:ilvl w:val="0"/>
           <w:numId w:val="29"/>
@@ -1533,7 +1955,7 @@
       <w:hyperlink r:id="rId9" w:tgtFrame="_new" w:history="1">
         <w:r>
           <w:rPr>
-            <w:rStyle w:val="Hyperlink"/>
+            <w:rStyle w:val="-"/>
           </w:rPr>
           <w:t>Doodle Menu-Like Song</w:t>
         </w:r>
@@ -1541,7 +1963,7 @@
     </w:p>
     <w:p>
       <w:pPr>
-        <w:pStyle w:val="ListParagraph"/>
+        <w:pStyle w:val="a6"/>
         <w:numPr>
           <w:ilvl w:val="0"/>
           <w:numId w:val="29"/>
@@ -1567,7 +1989,7 @@
       <w:hyperlink r:id="rId10" w:tgtFrame="_new" w:history="1">
         <w:r>
           <w:rPr>
-            <w:rStyle w:val="Hyperlink"/>
+            <w:rStyle w:val="-"/>
           </w:rPr>
           <w:t>freesound_community</w:t>
         </w:r>
@@ -1578,7 +2000,7 @@
       <w:hyperlink r:id="rId11" w:tgtFrame="_new" w:history="1">
         <w:r>
           <w:rPr>
-            <w:rStyle w:val="Hyperlink"/>
+            <w:rStyle w:val="-"/>
           </w:rPr>
           <w:t>Pixabay</w:t>
         </w:r>
@@ -1586,7 +2008,7 @@
     </w:p>
     <w:p>
       <w:pPr>
-        <w:pStyle w:val="ListParagraph"/>
+        <w:pStyle w:val="a6"/>
         <w:numPr>
           <w:ilvl w:val="0"/>
           <w:numId w:val="29"/>
@@ -1597,7 +2019,6 @@
           <w:b/>
           <w:bCs/>
         </w:rPr>
-        <w:lastRenderedPageBreak/>
         <w:t>Button Click Sound:</w:t>
       </w:r>
       <w:r>
@@ -1613,7 +2034,7 @@
       <w:hyperlink r:id="rId12" w:tgtFrame="_new" w:history="1">
         <w:r>
           <w:rPr>
-            <w:rStyle w:val="Hyperlink"/>
+            <w:rStyle w:val="-"/>
           </w:rPr>
           <w:t>Jurij</w:t>
         </w:r>
@@ -1624,7 +2045,7 @@
       <w:hyperlink r:id="rId13" w:tgtFrame="_new" w:history="1">
         <w:r>
           <w:rPr>
-            <w:rStyle w:val="Hyperlink"/>
+            <w:rStyle w:val="-"/>
           </w:rPr>
           <w:t>Pixabay</w:t>
         </w:r>
@@ -1632,7 +2053,7 @@
     </w:p>
     <w:p>
       <w:pPr>
-        <w:pStyle w:val="ListParagraph"/>
+        <w:pStyle w:val="a6"/>
         <w:numPr>
           <w:ilvl w:val="0"/>
           <w:numId w:val="29"/>
@@ -1655,7 +2076,7 @@
       <w:hyperlink r:id="rId14" w:tgtFrame="_new" w:history="1">
         <w:r>
           <w:rPr>
-            <w:rStyle w:val="Hyperlink"/>
+            <w:rStyle w:val="-"/>
           </w:rPr>
           <w:t>Game Over Bad Chest SFX</w:t>
         </w:r>
@@ -1663,7 +2084,7 @@
     </w:p>
     <w:p>
       <w:pPr>
-        <w:pStyle w:val="ListParagraph"/>
+        <w:pStyle w:val="a6"/>
         <w:numPr>
           <w:ilvl w:val="0"/>
           <w:numId w:val="29"/>
@@ -1689,7 +2110,7 @@
       <w:hyperlink r:id="rId15" w:tgtFrame="_new" w:history="1">
         <w:r>
           <w:rPr>
-            <w:rStyle w:val="Hyperlink"/>
+            <w:rStyle w:val="-"/>
           </w:rPr>
           <w:t>freesound_community</w:t>
         </w:r>
@@ -1700,7 +2121,7 @@
       <w:hyperlink r:id="rId16" w:tgtFrame="_new" w:history="1">
         <w:r>
           <w:rPr>
-            <w:rStyle w:val="Hyperlink"/>
+            <w:rStyle w:val="-"/>
           </w:rPr>
           <w:t>Pixabay</w:t>
         </w:r>
@@ -1708,7 +2129,7 @@
     </w:p>
     <w:p>
       <w:pPr>
-        <w:pStyle w:val="ListParagraph"/>
+        <w:pStyle w:val="a6"/>
         <w:numPr>
           <w:ilvl w:val="0"/>
           <w:numId w:val="29"/>
@@ -1731,7 +2152,7 @@
       <w:hyperlink r:id="rId17" w:tgtFrame="_new" w:history="1">
         <w:r>
           <w:rPr>
-            <w:rStyle w:val="Hyperlink"/>
+            <w:rStyle w:val="-"/>
           </w:rPr>
           <w:t>Heart Icon</w:t>
         </w:r>
@@ -1739,7 +2160,7 @@
     </w:p>
     <w:p>
       <w:pPr>
-        <w:pStyle w:val="ListParagraph"/>
+        <w:pStyle w:val="a6"/>
         <w:numPr>
           <w:ilvl w:val="0"/>
           <w:numId w:val="29"/>
@@ -1759,20 +2180,115 @@
     </w:p>
     <w:p>
       <w:pPr>
-        <w:pStyle w:val="ListParagraph"/>
-        <w:rPr>
-          <w:b/>
-          <w:bCs/>
+        <w:pStyle w:val="a6"/>
+        <w:rPr>
+          <w:rStyle w:val="-"/>
         </w:rPr>
       </w:pPr>
       <w:hyperlink r:id="rId18" w:tgtFrame="_new" w:history="1">
         <w:r>
           <w:rPr>
-            <w:rStyle w:val="Hyperlink"/>
+            <w:rStyle w:val="-"/>
           </w:rPr>
-          <w:t>Battle Background Image</w:t>
+          <w:t>Battle Backgroun</w:t>
+        </w:r>
+        <w:r>
+          <w:rPr>
+            <w:rStyle w:val="-"/>
+          </w:rPr>
+          <w:t>d</w:t>
+        </w:r>
+        <w:r>
+          <w:rPr>
+            <w:rStyle w:val="-"/>
+          </w:rPr>
+          <w:t xml:space="preserve"> Image</w:t>
         </w:r>
       </w:hyperlink>
+    </w:p>
+    <w:p>
+      <w:pPr>
+        <w:pStyle w:val="a6"/>
+        <w:numPr>
+          <w:ilvl w:val="0"/>
+          <w:numId w:val="29"/>
+        </w:numPr>
+        <w:rPr>
+          <w:b/>
+          <w:bCs/>
+        </w:rPr>
+      </w:pPr>
+      <w:r>
+        <w:rPr>
+          <w:b/>
+          <w:bCs/>
+        </w:rPr>
+        <w:t>Map</w:t>
+      </w:r>
+      <w:r>
+        <w:rPr>
+          <w:b/>
+          <w:bCs/>
+        </w:rPr>
+        <w:t xml:space="preserve"> Background Image:</w:t>
+      </w:r>
+    </w:p>
+    <w:p>
+      <w:pPr>
+        <w:pStyle w:val="a6"/>
+        <w:rPr>
+          <w:rStyle w:val="-"/>
+        </w:rPr>
+      </w:pPr>
+      <w:hyperlink r:id="rId19" w:tgtFrame="_new" w:history="1">
+        <w:r>
+          <w:rPr>
+            <w:rStyle w:val="-"/>
+          </w:rPr>
+          <w:t>Map</w:t>
+        </w:r>
+        <w:r>
+          <w:rPr>
+            <w:rStyle w:val="-"/>
+          </w:rPr>
+          <w:t xml:space="preserve"> Backgroun</w:t>
+        </w:r>
+        <w:r>
+          <w:rPr>
+            <w:rStyle w:val="-"/>
+          </w:rPr>
+          <w:t>d</w:t>
+        </w:r>
+        <w:r>
+          <w:rPr>
+            <w:rStyle w:val="-"/>
+          </w:rPr>
+          <w:t xml:space="preserve"> Image</w:t>
+        </w:r>
+      </w:hyperlink>
+    </w:p>
+    <w:p>
+      <w:pPr>
+        <w:pStyle w:val="a6"/>
+        <w:rPr>
+          <w:rStyle w:val="-"/>
+        </w:rPr>
+      </w:pPr>
+    </w:p>
+    <w:p>
+      <w:pPr>
+        <w:rPr>
+          <w:b/>
+          <w:bCs/>
+        </w:rPr>
+      </w:pPr>
+      <w:r>
+        <w:rPr>
+          <w:b/>
+          <w:bCs/>
+        </w:rPr>
+        <w:t>All the remaining assets were sourced from OpenGameArt.org.</w:t>
+      </w:r>
     </w:p>
     <w:p>
       <w:pPr>
@@ -1804,7 +2320,7 @@
 </file>
 
 <file path=word/numbering.xml><?xml version="1.0" encoding="utf-8"?>
-<w:numbering xmlns:wpc="http://schemas.microsoft.com/office/word/2010/wordprocessingCanvas" xmlns:cx="http://schemas.microsoft.com/office/drawing/2014/chartex" xmlns:cx1="http://schemas.microsoft.com/office/drawing/2015/9/8/chartex" xmlns:cx2="http://schemas.microsoft.com/office/drawing/2015/10/21/chartex" xmlns:cx3="http://schemas.microsoft.com/office/drawing/2016/5/9/chartex" xmlns:cx4="http://schemas.microsoft.com/office/drawing/2016/5/10/chartex" xmlns:cx5="http://schemas.microsoft.com/office/drawing/2016/5/11/chartex" xmlns:cx6="http://schemas.microsoft.com/office/drawing/2016/5/12/chartex" xmlns:cx7="http://schemas.microsoft.com/office/drawing/2016/5/13/chartex" xmlns:cx8="http://schemas.microsoft.com/office/drawing/2016/5/14/chartex" xmlns:mc="http://schemas.openxmlformats.org/markup-compatibility/2006" xmlns:aink="http://schemas.microsoft.com/office/drawing/2016/ink" xmlns:am3d="http://schemas.microsoft.com/office/drawing/2017/model3d" xmlns:o="urn:schemas-microsoft-com:office:office" xmlns:oel="http://schemas.microsoft.com/office/2019/extlst" xmlns:r="http://schemas.openxmlformats.org/officeDocument/2006/relationships" xmlns:m="http://schemas.openxmlformats.org/officeDocument/2006/math" xmlns:v="urn:schemas-microsoft-com:vml" xmlns:wp14="http://schemas.microsoft.com/office/word/2010/wordprocessingDrawing" xmlns:wp="http://schemas.openxmlformats.org/drawingml/2006/wordprocessingDrawing" xmlns:w10="urn:schemas-microsoft-com:office:word" xmlns:w="http://schemas.openxmlformats.org/wordprocessingml/2006/main" xmlns:w14="http://schemas.microsoft.com/office/word/2010/wordml" xmlns:w15="http://schemas.microsoft.com/office/word/2012/wordml" xmlns:w16cex="http://schemas.microsoft.com/office/word/2018/wordml/cex" xmlns:w16cid="http://schemas.microsoft.com/office/word/2016/wordml/cid" xmlns:w16="http://schemas.microsoft.com/office/word/2018/wordml" xmlns:w16du="http://schemas.microsoft.com/office/word/2023/wordml/word16du" xmlns:w16sdtdh="http://schemas.microsoft.com/office/word/2020/wordml/sdtdatahash" xmlns:w16se="http://schemas.microsoft.com/office/word/2015/wordml/symex" xmlns:wpg="http://schemas.microsoft.com/office/word/2010/wordprocessingGroup" xmlns:wpi="http://schemas.microsoft.com/office/word/2010/wordprocessingInk" xmlns:wne="http://schemas.microsoft.com/office/word/2006/wordml" xmlns:wps="http://schemas.microsoft.com/office/word/2010/wordprocessingShape" mc:Ignorable="w14 w15 w16se w16cid w16 w16cex w16sdtdh w16du wp14">
+<w:numbering xmlns:wpc="http://schemas.microsoft.com/office/word/2010/wordprocessingCanvas" xmlns:cx="http://schemas.microsoft.com/office/drawing/2014/chartex" xmlns:cx1="http://schemas.microsoft.com/office/drawing/2015/9/8/chartex" xmlns:cx2="http://schemas.microsoft.com/office/drawing/2015/10/21/chartex" xmlns:cx3="http://schemas.microsoft.com/office/drawing/2016/5/9/chartex" xmlns:cx4="http://schemas.microsoft.com/office/drawing/2016/5/10/chartex" xmlns:cx5="http://schemas.microsoft.com/office/drawing/2016/5/11/chartex" xmlns:cx6="http://schemas.microsoft.com/office/drawing/2016/5/12/chartex" xmlns:cx7="http://schemas.microsoft.com/office/drawing/2016/5/13/chartex" xmlns:cx8="http://schemas.microsoft.com/office/drawing/2016/5/14/chartex" xmlns:mc="http://schemas.openxmlformats.org/markup-compatibility/2006" xmlns:aink="http://schemas.microsoft.com/office/drawing/2016/ink" xmlns:am3d="http://schemas.microsoft.com/office/drawing/2017/model3d" xmlns:o="urn:schemas-microsoft-com:office:office" xmlns:oel="http://schemas.microsoft.com/office/2019/extlst" xmlns:r="http://schemas.openxmlformats.org/officeDocument/2006/relationships" xmlns:m="http://schemas.openxmlformats.org/officeDocument/2006/math" xmlns:v="urn:schemas-microsoft-com:vml" xmlns:wp14="http://schemas.microsoft.com/office/word/2010/wordprocessingDrawing" xmlns:wp="http://schemas.openxmlformats.org/drawingml/2006/wordprocessingDrawing" xmlns:w10="urn:schemas-microsoft-com:office:word" xmlns:w="http://schemas.openxmlformats.org/wordprocessingml/2006/main" xmlns:w14="http://schemas.microsoft.com/office/word/2010/wordml" xmlns:w15="http://schemas.microsoft.com/office/word/2012/wordml" xmlns:w16cex="http://schemas.microsoft.com/office/word/2018/wordml/cex" xmlns:w16cid="http://schemas.microsoft.com/office/word/2016/wordml/cid" xmlns:w16="http://schemas.microsoft.com/office/word/2018/wordml" xmlns:w16du="http://schemas.microsoft.com/office/word/2023/wordml/word16du" xmlns:w16sdtdh="http://schemas.microsoft.com/office/word/2020/wordml/sdtdatahash" xmlns:w16sdtfl="http://schemas.microsoft.com/office/word/2024/wordml/sdtformatlock" xmlns:w16se="http://schemas.microsoft.com/office/word/2015/wordml/symex" xmlns:wpg="http://schemas.microsoft.com/office/word/2010/wordprocessingGroup" xmlns:wpi="http://schemas.microsoft.com/office/word/2010/wordprocessingInk" xmlns:wne="http://schemas.microsoft.com/office/word/2006/wordml" xmlns:wps="http://schemas.microsoft.com/office/word/2010/wordprocessingShape" mc:Ignorable="w14 w15 w16se w16cid w16 w16cex w16sdtdh w16sdtfl w16du wp14">
   <w:abstractNum w:abstractNumId="0" w15:restartNumberingAfterBreak="0">
     <w:nsid w:val="00B4233D"/>
     <w:multiLevelType w:val="multilevel"/>
@@ -4473,6 +4989,155 @@
     </w:lvl>
   </w:abstractNum>
   <w:abstractNum w:abstractNumId="19" w15:restartNumberingAfterBreak="0">
+    <w:nsid w:val="47D74336"/>
+    <w:multiLevelType w:val="multilevel"/>
+    <w:tmpl w:val="571AE07E"/>
+    <w:lvl w:ilvl="0">
+      <w:start w:val="1"/>
+      <w:numFmt w:val="bullet"/>
+      <w:lvlText w:val=""/>
+      <w:lvlJc w:val="left"/>
+      <w:pPr>
+        <w:tabs>
+          <w:tab w:val="num" w:pos="720"/>
+        </w:tabs>
+        <w:ind w:left="720" w:hanging="360"/>
+      </w:pPr>
+      <w:rPr>
+        <w:rFonts w:ascii="Symbol" w:hAnsi="Symbol" w:hint="default"/>
+        <w:sz w:val="20"/>
+      </w:rPr>
+    </w:lvl>
+    <w:lvl w:ilvl="1" w:tentative="1">
+      <w:start w:val="1"/>
+      <w:numFmt w:val="bullet"/>
+      <w:lvlText w:val="o"/>
+      <w:lvlJc w:val="left"/>
+      <w:pPr>
+        <w:tabs>
+          <w:tab w:val="num" w:pos="1440"/>
+        </w:tabs>
+        <w:ind w:left="1440" w:hanging="360"/>
+      </w:pPr>
+      <w:rPr>
+        <w:rFonts w:ascii="Courier New" w:hAnsi="Courier New" w:hint="default"/>
+        <w:sz w:val="20"/>
+      </w:rPr>
+    </w:lvl>
+    <w:lvl w:ilvl="2" w:tentative="1">
+      <w:start w:val="1"/>
+      <w:numFmt w:val="bullet"/>
+      <w:lvlText w:val=""/>
+      <w:lvlJc w:val="left"/>
+      <w:pPr>
+        <w:tabs>
+          <w:tab w:val="num" w:pos="2160"/>
+        </w:tabs>
+        <w:ind w:left="2160" w:hanging="360"/>
+      </w:pPr>
+      <w:rPr>
+        <w:rFonts w:ascii="Wingdings" w:hAnsi="Wingdings" w:hint="default"/>
+        <w:sz w:val="20"/>
+      </w:rPr>
+    </w:lvl>
+    <w:lvl w:ilvl="3" w:tentative="1">
+      <w:start w:val="1"/>
+      <w:numFmt w:val="bullet"/>
+      <w:lvlText w:val=""/>
+      <w:lvlJc w:val="left"/>
+      <w:pPr>
+        <w:tabs>
+          <w:tab w:val="num" w:pos="2880"/>
+        </w:tabs>
+        <w:ind w:left="2880" w:hanging="360"/>
+      </w:pPr>
+      <w:rPr>
+        <w:rFonts w:ascii="Wingdings" w:hAnsi="Wingdings" w:hint="default"/>
+        <w:sz w:val="20"/>
+      </w:rPr>
+    </w:lvl>
+    <w:lvl w:ilvl="4" w:tentative="1">
+      <w:start w:val="1"/>
+      <w:numFmt w:val="bullet"/>
+      <w:lvlText w:val=""/>
+      <w:lvlJc w:val="left"/>
+      <w:pPr>
+        <w:tabs>
+          <w:tab w:val="num" w:pos="3600"/>
+        </w:tabs>
+        <w:ind w:left="3600" w:hanging="360"/>
+      </w:pPr>
+      <w:rPr>
+        <w:rFonts w:ascii="Wingdings" w:hAnsi="Wingdings" w:hint="default"/>
+        <w:sz w:val="20"/>
+      </w:rPr>
+    </w:lvl>
+    <w:lvl w:ilvl="5" w:tentative="1">
+      <w:start w:val="1"/>
+      <w:numFmt w:val="bullet"/>
+      <w:lvlText w:val=""/>
+      <w:lvlJc w:val="left"/>
+      <w:pPr>
+        <w:tabs>
+          <w:tab w:val="num" w:pos="4320"/>
+        </w:tabs>
+        <w:ind w:left="4320" w:hanging="360"/>
+      </w:pPr>
+      <w:rPr>
+        <w:rFonts w:ascii="Wingdings" w:hAnsi="Wingdings" w:hint="default"/>
+        <w:sz w:val="20"/>
+      </w:rPr>
+    </w:lvl>
+    <w:lvl w:ilvl="6" w:tentative="1">
+      <w:start w:val="1"/>
+      <w:numFmt w:val="bullet"/>
+      <w:lvlText w:val=""/>
+      <w:lvlJc w:val="left"/>
+      <w:pPr>
+        <w:tabs>
+          <w:tab w:val="num" w:pos="5040"/>
+        </w:tabs>
+        <w:ind w:left="5040" w:hanging="360"/>
+      </w:pPr>
+      <w:rPr>
+        <w:rFonts w:ascii="Wingdings" w:hAnsi="Wingdings" w:hint="default"/>
+        <w:sz w:val="20"/>
+      </w:rPr>
+    </w:lvl>
+    <w:lvl w:ilvl="7" w:tentative="1">
+      <w:start w:val="1"/>
+      <w:numFmt w:val="bullet"/>
+      <w:lvlText w:val=""/>
+      <w:lvlJc w:val="left"/>
+      <w:pPr>
+        <w:tabs>
+          <w:tab w:val="num" w:pos="5760"/>
+        </w:tabs>
+        <w:ind w:left="5760" w:hanging="360"/>
+      </w:pPr>
+      <w:rPr>
+        <w:rFonts w:ascii="Wingdings" w:hAnsi="Wingdings" w:hint="default"/>
+        <w:sz w:val="20"/>
+      </w:rPr>
+    </w:lvl>
+    <w:lvl w:ilvl="8" w:tentative="1">
+      <w:start w:val="1"/>
+      <w:numFmt w:val="bullet"/>
+      <w:lvlText w:val=""/>
+      <w:lvlJc w:val="left"/>
+      <w:pPr>
+        <w:tabs>
+          <w:tab w:val="num" w:pos="6480"/>
+        </w:tabs>
+        <w:ind w:left="6480" w:hanging="360"/>
+      </w:pPr>
+      <w:rPr>
+        <w:rFonts w:ascii="Wingdings" w:hAnsi="Wingdings" w:hint="default"/>
+        <w:sz w:val="20"/>
+      </w:rPr>
+    </w:lvl>
+  </w:abstractNum>
+  <w:abstractNum w:abstractNumId="20" w15:restartNumberingAfterBreak="0">
     <w:nsid w:val="481F17FB"/>
     <w:multiLevelType w:val="multilevel"/>
     <w:tmpl w:val="3ED26D7A"/>
@@ -4589,7 +5254,7 @@
       </w:pPr>
     </w:lvl>
   </w:abstractNum>
-  <w:abstractNum w:abstractNumId="20" w15:restartNumberingAfterBreak="0">
+  <w:abstractNum w:abstractNumId="21" w15:restartNumberingAfterBreak="0">
     <w:nsid w:val="537B6443"/>
     <w:multiLevelType w:val="multilevel"/>
     <w:tmpl w:val="6448A722"/>
@@ -4738,7 +5403,7 @@
       </w:rPr>
     </w:lvl>
   </w:abstractNum>
-  <w:abstractNum w:abstractNumId="21" w15:restartNumberingAfterBreak="0">
+  <w:abstractNum w:abstractNumId="22" w15:restartNumberingAfterBreak="0">
     <w:nsid w:val="5A647B37"/>
     <w:multiLevelType w:val="multilevel"/>
     <w:tmpl w:val="61D0BD64"/>
@@ -4855,7 +5520,7 @@
       </w:pPr>
     </w:lvl>
   </w:abstractNum>
-  <w:abstractNum w:abstractNumId="22" w15:restartNumberingAfterBreak="0">
+  <w:abstractNum w:abstractNumId="23" w15:restartNumberingAfterBreak="0">
     <w:nsid w:val="62854EEF"/>
     <w:multiLevelType w:val="multilevel"/>
     <w:tmpl w:val="D40C5F1E"/>
@@ -5004,7 +5669,7 @@
       </w:rPr>
     </w:lvl>
   </w:abstractNum>
-  <w:abstractNum w:abstractNumId="23" w15:restartNumberingAfterBreak="0">
+  <w:abstractNum w:abstractNumId="24" w15:restartNumberingAfterBreak="0">
     <w:nsid w:val="64000E40"/>
     <w:multiLevelType w:val="multilevel"/>
     <w:tmpl w:val="DFDC81FA"/>
@@ -5153,7 +5818,7 @@
       </w:rPr>
     </w:lvl>
   </w:abstractNum>
-  <w:abstractNum w:abstractNumId="24" w15:restartNumberingAfterBreak="0">
+  <w:abstractNum w:abstractNumId="25" w15:restartNumberingAfterBreak="0">
     <w:nsid w:val="6BAC7470"/>
     <w:multiLevelType w:val="multilevel"/>
     <w:tmpl w:val="7C344F8A"/>
@@ -5302,7 +5967,7 @@
       </w:rPr>
     </w:lvl>
   </w:abstractNum>
-  <w:abstractNum w:abstractNumId="25" w15:restartNumberingAfterBreak="0">
+  <w:abstractNum w:abstractNumId="26" w15:restartNumberingAfterBreak="0">
     <w:nsid w:val="6C263077"/>
     <w:multiLevelType w:val="multilevel"/>
     <w:tmpl w:val="077C5A06"/>
@@ -5451,7 +6116,7 @@
       </w:rPr>
     </w:lvl>
   </w:abstractNum>
-  <w:abstractNum w:abstractNumId="26" w15:restartNumberingAfterBreak="0">
+  <w:abstractNum w:abstractNumId="27" w15:restartNumberingAfterBreak="0">
     <w:nsid w:val="6FD929E8"/>
     <w:multiLevelType w:val="multilevel"/>
     <w:tmpl w:val="C49E8278"/>
@@ -5568,7 +6233,7 @@
       </w:pPr>
     </w:lvl>
   </w:abstractNum>
-  <w:abstractNum w:abstractNumId="27" w15:restartNumberingAfterBreak="0">
+  <w:abstractNum w:abstractNumId="28" w15:restartNumberingAfterBreak="0">
     <w:nsid w:val="70264090"/>
     <w:multiLevelType w:val="multilevel"/>
     <w:tmpl w:val="15EA3A28"/>
@@ -5717,7 +6382,7 @@
       </w:rPr>
     </w:lvl>
   </w:abstractNum>
-  <w:abstractNum w:abstractNumId="28" w15:restartNumberingAfterBreak="0">
+  <w:abstractNum w:abstractNumId="29" w15:restartNumberingAfterBreak="0">
     <w:nsid w:val="717E2FF5"/>
     <w:multiLevelType w:val="multilevel"/>
     <w:tmpl w:val="F0FE0228"/>
@@ -5866,7 +6531,156 @@
       </w:rPr>
     </w:lvl>
   </w:abstractNum>
-  <w:abstractNum w:abstractNumId="29" w15:restartNumberingAfterBreak="0">
+  <w:abstractNum w:abstractNumId="30" w15:restartNumberingAfterBreak="0">
+    <w:nsid w:val="71CA10AF"/>
+    <w:multiLevelType w:val="multilevel"/>
+    <w:tmpl w:val="69B25498"/>
+    <w:lvl w:ilvl="0">
+      <w:start w:val="1"/>
+      <w:numFmt w:val="bullet"/>
+      <w:lvlText w:val=""/>
+      <w:lvlJc w:val="left"/>
+      <w:pPr>
+        <w:tabs>
+          <w:tab w:val="num" w:pos="720"/>
+        </w:tabs>
+        <w:ind w:left="720" w:hanging="360"/>
+      </w:pPr>
+      <w:rPr>
+        <w:rFonts w:ascii="Symbol" w:hAnsi="Symbol" w:hint="default"/>
+        <w:sz w:val="20"/>
+      </w:rPr>
+    </w:lvl>
+    <w:lvl w:ilvl="1">
+      <w:start w:val="1"/>
+      <w:numFmt w:val="bullet"/>
+      <w:lvlText w:val="o"/>
+      <w:lvlJc w:val="left"/>
+      <w:pPr>
+        <w:tabs>
+          <w:tab w:val="num" w:pos="1440"/>
+        </w:tabs>
+        <w:ind w:left="1440" w:hanging="360"/>
+      </w:pPr>
+      <w:rPr>
+        <w:rFonts w:ascii="Courier New" w:hAnsi="Courier New" w:hint="default"/>
+        <w:sz w:val="20"/>
+      </w:rPr>
+    </w:lvl>
+    <w:lvl w:ilvl="2">
+      <w:start w:val="1"/>
+      <w:numFmt w:val="bullet"/>
+      <w:lvlText w:val=""/>
+      <w:lvlJc w:val="left"/>
+      <w:pPr>
+        <w:tabs>
+          <w:tab w:val="num" w:pos="2160"/>
+        </w:tabs>
+        <w:ind w:left="2160" w:hanging="360"/>
+      </w:pPr>
+      <w:rPr>
+        <w:rFonts w:ascii="Wingdings" w:hAnsi="Wingdings" w:hint="default"/>
+        <w:sz w:val="20"/>
+      </w:rPr>
+    </w:lvl>
+    <w:lvl w:ilvl="3" w:tentative="1">
+      <w:start w:val="1"/>
+      <w:numFmt w:val="bullet"/>
+      <w:lvlText w:val=""/>
+      <w:lvlJc w:val="left"/>
+      <w:pPr>
+        <w:tabs>
+          <w:tab w:val="num" w:pos="2880"/>
+        </w:tabs>
+        <w:ind w:left="2880" w:hanging="360"/>
+      </w:pPr>
+      <w:rPr>
+        <w:rFonts w:ascii="Wingdings" w:hAnsi="Wingdings" w:hint="default"/>
+        <w:sz w:val="20"/>
+      </w:rPr>
+    </w:lvl>
+    <w:lvl w:ilvl="4" w:tentative="1">
+      <w:start w:val="1"/>
+      <w:numFmt w:val="bullet"/>
+      <w:lvlText w:val=""/>
+      <w:lvlJc w:val="left"/>
+      <w:pPr>
+        <w:tabs>
+          <w:tab w:val="num" w:pos="3600"/>
+        </w:tabs>
+        <w:ind w:left="3600" w:hanging="360"/>
+      </w:pPr>
+      <w:rPr>
+        <w:rFonts w:ascii="Wingdings" w:hAnsi="Wingdings" w:hint="default"/>
+        <w:sz w:val="20"/>
+      </w:rPr>
+    </w:lvl>
+    <w:lvl w:ilvl="5" w:tentative="1">
+      <w:start w:val="1"/>
+      <w:numFmt w:val="bullet"/>
+      <w:lvlText w:val=""/>
+      <w:lvlJc w:val="left"/>
+      <w:pPr>
+        <w:tabs>
+          <w:tab w:val="num" w:pos="4320"/>
+        </w:tabs>
+        <w:ind w:left="4320" w:hanging="360"/>
+      </w:pPr>
+      <w:rPr>
+        <w:rFonts w:ascii="Wingdings" w:hAnsi="Wingdings" w:hint="default"/>
+        <w:sz w:val="20"/>
+      </w:rPr>
+    </w:lvl>
+    <w:lvl w:ilvl="6" w:tentative="1">
+      <w:start w:val="1"/>
+      <w:numFmt w:val="bullet"/>
+      <w:lvlText w:val=""/>
+      <w:lvlJc w:val="left"/>
+      <w:pPr>
+        <w:tabs>
+          <w:tab w:val="num" w:pos="5040"/>
+        </w:tabs>
+        <w:ind w:left="5040" w:hanging="360"/>
+      </w:pPr>
+      <w:rPr>
+        <w:rFonts w:ascii="Wingdings" w:hAnsi="Wingdings" w:hint="default"/>
+        <w:sz w:val="20"/>
+      </w:rPr>
+    </w:lvl>
+    <w:lvl w:ilvl="7" w:tentative="1">
+      <w:start w:val="1"/>
+      <w:numFmt w:val="bullet"/>
+      <w:lvlText w:val=""/>
+      <w:lvlJc w:val="left"/>
+      <w:pPr>
+        <w:tabs>
+          <w:tab w:val="num" w:pos="5760"/>
+        </w:tabs>
+        <w:ind w:left="5760" w:hanging="360"/>
+      </w:pPr>
+      <w:rPr>
+        <w:rFonts w:ascii="Wingdings" w:hAnsi="Wingdings" w:hint="default"/>
+        <w:sz w:val="20"/>
+      </w:rPr>
+    </w:lvl>
+    <w:lvl w:ilvl="8" w:tentative="1">
+      <w:start w:val="1"/>
+      <w:numFmt w:val="bullet"/>
+      <w:lvlText w:val=""/>
+      <w:lvlJc w:val="left"/>
+      <w:pPr>
+        <w:tabs>
+          <w:tab w:val="num" w:pos="6480"/>
+        </w:tabs>
+        <w:ind w:left="6480" w:hanging="360"/>
+      </w:pPr>
+      <w:rPr>
+        <w:rFonts w:ascii="Wingdings" w:hAnsi="Wingdings" w:hint="default"/>
+        <w:sz w:val="20"/>
+      </w:rPr>
+    </w:lvl>
+  </w:abstractNum>
+  <w:abstractNum w:abstractNumId="31" w15:restartNumberingAfterBreak="0">
     <w:nsid w:val="7250265B"/>
     <w:multiLevelType w:val="multilevel"/>
     <w:tmpl w:val="644AD9F2"/>
@@ -6016,22 +6830,22 @@
     </w:lvl>
   </w:abstractNum>
   <w:num w:numId="1" w16cid:durableId="856889214">
-    <w:abstractNumId w:val="19"/>
+    <w:abstractNumId w:val="20"/>
   </w:num>
   <w:num w:numId="2" w16cid:durableId="1494449095">
-    <w:abstractNumId w:val="26"/>
+    <w:abstractNumId w:val="27"/>
   </w:num>
   <w:num w:numId="3" w16cid:durableId="1331174904">
+    <w:abstractNumId w:val="23"/>
+  </w:num>
+  <w:num w:numId="4" w16cid:durableId="1830827103">
+    <w:abstractNumId w:val="31"/>
+  </w:num>
+  <w:num w:numId="5" w16cid:durableId="405539876">
     <w:abstractNumId w:val="22"/>
   </w:num>
-  <w:num w:numId="4" w16cid:durableId="1830827103">
-    <w:abstractNumId w:val="29"/>
-  </w:num>
-  <w:num w:numId="5" w16cid:durableId="405539876">
-    <w:abstractNumId w:val="21"/>
-  </w:num>
   <w:num w:numId="6" w16cid:durableId="1873104118">
-    <w:abstractNumId w:val="24"/>
+    <w:abstractNumId w:val="25"/>
   </w:num>
   <w:num w:numId="7" w16cid:durableId="16545786">
     <w:abstractNumId w:val="12"/>
@@ -6046,10 +6860,10 @@
     <w:abstractNumId w:val="13"/>
   </w:num>
   <w:num w:numId="11" w16cid:durableId="459035746">
-    <w:abstractNumId w:val="28"/>
+    <w:abstractNumId w:val="29"/>
   </w:num>
   <w:num w:numId="12" w16cid:durableId="1130631320">
-    <w:abstractNumId w:val="27"/>
+    <w:abstractNumId w:val="28"/>
   </w:num>
   <w:num w:numId="13" w16cid:durableId="690225997">
     <w:abstractNumId w:val="14"/>
@@ -6076,7 +6890,7 @@
     <w:abstractNumId w:val="2"/>
   </w:num>
   <w:num w:numId="21" w16cid:durableId="1764573282">
-    <w:abstractNumId w:val="23"/>
+    <w:abstractNumId w:val="24"/>
   </w:num>
   <w:num w:numId="22" w16cid:durableId="967392866">
     <w:abstractNumId w:val="18"/>
@@ -6088,10 +6902,10 @@
     <w:abstractNumId w:val="7"/>
   </w:num>
   <w:num w:numId="25" w16cid:durableId="742139833">
-    <w:abstractNumId w:val="20"/>
+    <w:abstractNumId w:val="21"/>
   </w:num>
   <w:num w:numId="26" w16cid:durableId="2013608745">
-    <w:abstractNumId w:val="25"/>
+    <w:abstractNumId w:val="26"/>
   </w:num>
   <w:num w:numId="27" w16cid:durableId="1262639610">
     <w:abstractNumId w:val="8"/>
@@ -6105,11 +6919,17 @@
   <w:num w:numId="30" w16cid:durableId="1699694468">
     <w:abstractNumId w:val="9"/>
   </w:num>
+  <w:num w:numId="31" w16cid:durableId="1616329057">
+    <w:abstractNumId w:val="30"/>
+  </w:num>
+  <w:num w:numId="32" w16cid:durableId="1816950479">
+    <w:abstractNumId w:val="19"/>
+  </w:num>
 </w:numbering>
 </file>
 
 <file path=word/styles.xml><?xml version="1.0" encoding="utf-8"?>
-<w:styles xmlns:mc="http://schemas.openxmlformats.org/markup-compatibility/2006" xmlns:r="http://schemas.openxmlformats.org/officeDocument/2006/relationships" xmlns:w="http://schemas.openxmlformats.org/wordprocessingml/2006/main" xmlns:w14="http://schemas.microsoft.com/office/word/2010/wordml" xmlns:w15="http://schemas.microsoft.com/office/word/2012/wordml" xmlns:w16cex="http://schemas.microsoft.com/office/word/2018/wordml/cex" xmlns:w16cid="http://schemas.microsoft.com/office/word/2016/wordml/cid" xmlns:w16="http://schemas.microsoft.com/office/word/2018/wordml" xmlns:w16du="http://schemas.microsoft.com/office/word/2023/wordml/word16du" xmlns:w16sdtdh="http://schemas.microsoft.com/office/word/2020/wordml/sdtdatahash" xmlns:w16se="http://schemas.microsoft.com/office/word/2015/wordml/symex" mc:Ignorable="w14 w15 w16se w16cid w16 w16cex w16sdtdh w16du">
+<w:styles xmlns:mc="http://schemas.openxmlformats.org/markup-compatibility/2006" xmlns:r="http://schemas.openxmlformats.org/officeDocument/2006/relationships" xmlns:w="http://schemas.openxmlformats.org/wordprocessingml/2006/main" xmlns:w14="http://schemas.microsoft.com/office/word/2010/wordml" xmlns:w15="http://schemas.microsoft.com/office/word/2012/wordml" xmlns:w16cex="http://schemas.microsoft.com/office/word/2018/wordml/cex" xmlns:w16cid="http://schemas.microsoft.com/office/word/2016/wordml/cid" xmlns:w16="http://schemas.microsoft.com/office/word/2018/wordml" xmlns:w16du="http://schemas.microsoft.com/office/word/2023/wordml/word16du" xmlns:w16sdtdh="http://schemas.microsoft.com/office/word/2020/wordml/sdtdatahash" xmlns:w16sdtfl="http://schemas.microsoft.com/office/word/2024/wordml/sdtformatlock" xmlns:w16se="http://schemas.microsoft.com/office/word/2015/wordml/symex" mc:Ignorable="w14 w15 w16se w16cid w16 w16cex w16sdtdh w16sdtfl w16du">
   <w:docDefaults>
     <w:rPrDefault>
       <w:rPr>
@@ -6505,15 +7325,15 @@
     <w:lsdException w:name="Unresolved Mention" w:semiHidden="1" w:unhideWhenUsed="1"/>
     <w:lsdException w:name="Smart Link" w:semiHidden="1" w:unhideWhenUsed="1"/>
   </w:latentStyles>
-  <w:style w:type="paragraph" w:default="1" w:styleId="Normal">
+  <w:style w:type="paragraph" w:default="1" w:styleId="a">
     <w:name w:val="Normal"/>
     <w:qFormat/>
   </w:style>
-  <w:style w:type="paragraph" w:styleId="Heading1">
+  <w:style w:type="paragraph" w:styleId="1">
     <w:name w:val="heading 1"/>
-    <w:basedOn w:val="Normal"/>
-    <w:next w:val="Normal"/>
-    <w:link w:val="Heading1Char"/>
+    <w:basedOn w:val="a"/>
+    <w:next w:val="a"/>
+    <w:link w:val="1Char"/>
     <w:uiPriority w:val="9"/>
     <w:qFormat/>
     <w:rsid w:val="008E72A7"/>
@@ -6530,11 +7350,11 @@
       <w:szCs w:val="40"/>
     </w:rPr>
   </w:style>
-  <w:style w:type="paragraph" w:styleId="Heading2">
+  <w:style w:type="paragraph" w:styleId="2">
     <w:name w:val="heading 2"/>
-    <w:basedOn w:val="Normal"/>
-    <w:next w:val="Normal"/>
-    <w:link w:val="Heading2Char"/>
+    <w:basedOn w:val="a"/>
+    <w:next w:val="a"/>
+    <w:link w:val="2Char"/>
     <w:uiPriority w:val="9"/>
     <w:semiHidden/>
     <w:unhideWhenUsed/>
@@ -6553,11 +7373,11 @@
       <w:szCs w:val="32"/>
     </w:rPr>
   </w:style>
-  <w:style w:type="paragraph" w:styleId="Heading3">
+  <w:style w:type="paragraph" w:styleId="3">
     <w:name w:val="heading 3"/>
-    <w:basedOn w:val="Normal"/>
-    <w:next w:val="Normal"/>
-    <w:link w:val="Heading3Char"/>
+    <w:basedOn w:val="a"/>
+    <w:next w:val="a"/>
+    <w:link w:val="3Char"/>
     <w:uiPriority w:val="9"/>
     <w:semiHidden/>
     <w:unhideWhenUsed/>
@@ -6576,11 +7396,11 @@
       <w:szCs w:val="28"/>
     </w:rPr>
   </w:style>
-  <w:style w:type="paragraph" w:styleId="Heading4">
+  <w:style w:type="paragraph" w:styleId="4">
     <w:name w:val="heading 4"/>
-    <w:basedOn w:val="Normal"/>
-    <w:next w:val="Normal"/>
-    <w:link w:val="Heading4Char"/>
+    <w:basedOn w:val="a"/>
+    <w:next w:val="a"/>
+    <w:link w:val="4Char"/>
     <w:uiPriority w:val="9"/>
     <w:semiHidden/>
     <w:unhideWhenUsed/>
@@ -6599,11 +7419,11 @@
       <w:color w:val="0F4761" w:themeColor="accent1" w:themeShade="BF"/>
     </w:rPr>
   </w:style>
-  <w:style w:type="paragraph" w:styleId="Heading5">
+  <w:style w:type="paragraph" w:styleId="5">
     <w:name w:val="heading 5"/>
-    <w:basedOn w:val="Normal"/>
-    <w:next w:val="Normal"/>
-    <w:link w:val="Heading5Char"/>
+    <w:basedOn w:val="a"/>
+    <w:next w:val="a"/>
+    <w:link w:val="5Char"/>
     <w:uiPriority w:val="9"/>
     <w:semiHidden/>
     <w:unhideWhenUsed/>
@@ -6620,11 +7440,11 @@
       <w:color w:val="0F4761" w:themeColor="accent1" w:themeShade="BF"/>
     </w:rPr>
   </w:style>
-  <w:style w:type="paragraph" w:styleId="Heading6">
+  <w:style w:type="paragraph" w:styleId="6">
     <w:name w:val="heading 6"/>
-    <w:basedOn w:val="Normal"/>
-    <w:next w:val="Normal"/>
-    <w:link w:val="Heading6Char"/>
+    <w:basedOn w:val="a"/>
+    <w:next w:val="a"/>
+    <w:link w:val="6Char"/>
     <w:uiPriority w:val="9"/>
     <w:semiHidden/>
     <w:unhideWhenUsed/>
@@ -6643,11 +7463,11 @@
       <w:color w:val="595959" w:themeColor="text1" w:themeTint="A6"/>
     </w:rPr>
   </w:style>
-  <w:style w:type="paragraph" w:styleId="Heading7">
+  <w:style w:type="paragraph" w:styleId="7">
     <w:name w:val="heading 7"/>
-    <w:basedOn w:val="Normal"/>
-    <w:next w:val="Normal"/>
-    <w:link w:val="Heading7Char"/>
+    <w:basedOn w:val="a"/>
+    <w:next w:val="a"/>
+    <w:link w:val="7Char"/>
     <w:uiPriority w:val="9"/>
     <w:semiHidden/>
     <w:unhideWhenUsed/>
@@ -6664,11 +7484,11 @@
       <w:color w:val="595959" w:themeColor="text1" w:themeTint="A6"/>
     </w:rPr>
   </w:style>
-  <w:style w:type="paragraph" w:styleId="Heading8">
+  <w:style w:type="paragraph" w:styleId="8">
     <w:name w:val="heading 8"/>
-    <w:basedOn w:val="Normal"/>
-    <w:next w:val="Normal"/>
-    <w:link w:val="Heading8Char"/>
+    <w:basedOn w:val="a"/>
+    <w:next w:val="a"/>
+    <w:link w:val="8Char"/>
     <w:uiPriority w:val="9"/>
     <w:semiHidden/>
     <w:unhideWhenUsed/>
@@ -6687,11 +7507,11 @@
       <w:color w:val="272727" w:themeColor="text1" w:themeTint="D8"/>
     </w:rPr>
   </w:style>
-  <w:style w:type="paragraph" w:styleId="Heading9">
+  <w:style w:type="paragraph" w:styleId="9">
     <w:name w:val="heading 9"/>
-    <w:basedOn w:val="Normal"/>
-    <w:next w:val="Normal"/>
-    <w:link w:val="Heading9Char"/>
+    <w:basedOn w:val="a"/>
+    <w:next w:val="a"/>
+    <w:link w:val="9Char"/>
     <w:uiPriority w:val="9"/>
     <w:semiHidden/>
     <w:unhideWhenUsed/>
@@ -6708,12 +7528,12 @@
       <w:color w:val="272727" w:themeColor="text1" w:themeTint="D8"/>
     </w:rPr>
   </w:style>
-  <w:style w:type="character" w:default="1" w:styleId="DefaultParagraphFont">
+  <w:style w:type="character" w:default="1" w:styleId="a0">
     <w:name w:val="Default Paragraph Font"/>
     <w:uiPriority w:val="1"/>
     <w:unhideWhenUsed/>
   </w:style>
-  <w:style w:type="table" w:default="1" w:styleId="TableNormal">
+  <w:style w:type="table" w:default="1" w:styleId="a1">
     <w:name w:val="Normal Table"/>
     <w:uiPriority w:val="99"/>
     <w:semiHidden/>
@@ -6728,16 +7548,16 @@
       </w:tblCellMar>
     </w:tblPr>
   </w:style>
-  <w:style w:type="numbering" w:default="1" w:styleId="NoList">
+  <w:style w:type="numbering" w:default="1" w:styleId="a2">
     <w:name w:val="No List"/>
     <w:uiPriority w:val="99"/>
     <w:semiHidden/>
     <w:unhideWhenUsed/>
   </w:style>
-  <w:style w:type="character" w:customStyle="1" w:styleId="Heading1Char">
-    <w:name w:val="Heading 1 Char"/>
-    <w:basedOn w:val="DefaultParagraphFont"/>
-    <w:link w:val="Heading1"/>
+  <w:style w:type="character" w:customStyle="1" w:styleId="1Char">
+    <w:name w:val="Επικεφαλίδα 1 Char"/>
+    <w:basedOn w:val="a0"/>
+    <w:link w:val="1"/>
     <w:uiPriority w:val="9"/>
     <w:rsid w:val="008E72A7"/>
     <w:rPr>
@@ -6747,10 +7567,10 @@
       <w:szCs w:val="40"/>
     </w:rPr>
   </w:style>
-  <w:style w:type="character" w:customStyle="1" w:styleId="Heading2Char">
-    <w:name w:val="Heading 2 Char"/>
-    <w:basedOn w:val="DefaultParagraphFont"/>
-    <w:link w:val="Heading2"/>
+  <w:style w:type="character" w:customStyle="1" w:styleId="2Char">
+    <w:name w:val="Επικεφαλίδα 2 Char"/>
+    <w:basedOn w:val="a0"/>
+    <w:link w:val="2"/>
     <w:uiPriority w:val="9"/>
     <w:semiHidden/>
     <w:rsid w:val="008E72A7"/>
@@ -6761,10 +7581,10 @@
       <w:szCs w:val="32"/>
     </w:rPr>
   </w:style>
-  <w:style w:type="character" w:customStyle="1" w:styleId="Heading3Char">
-    <w:name w:val="Heading 3 Char"/>
-    <w:basedOn w:val="DefaultParagraphFont"/>
-    <w:link w:val="Heading3"/>
+  <w:style w:type="character" w:customStyle="1" w:styleId="3Char">
+    <w:name w:val="Επικεφαλίδα 3 Char"/>
+    <w:basedOn w:val="a0"/>
+    <w:link w:val="3"/>
     <w:uiPriority w:val="9"/>
     <w:semiHidden/>
     <w:rsid w:val="008E72A7"/>
@@ -6775,10 +7595,10 @@
       <w:szCs w:val="28"/>
     </w:rPr>
   </w:style>
-  <w:style w:type="character" w:customStyle="1" w:styleId="Heading4Char">
-    <w:name w:val="Heading 4 Char"/>
-    <w:basedOn w:val="DefaultParagraphFont"/>
-    <w:link w:val="Heading4"/>
+  <w:style w:type="character" w:customStyle="1" w:styleId="4Char">
+    <w:name w:val="Επικεφαλίδα 4 Char"/>
+    <w:basedOn w:val="a0"/>
+    <w:link w:val="4"/>
     <w:uiPriority w:val="9"/>
     <w:semiHidden/>
     <w:rsid w:val="008E72A7"/>
@@ -6789,10 +7609,10 @@
       <w:color w:val="0F4761" w:themeColor="accent1" w:themeShade="BF"/>
     </w:rPr>
   </w:style>
-  <w:style w:type="character" w:customStyle="1" w:styleId="Heading5Char">
-    <w:name w:val="Heading 5 Char"/>
-    <w:basedOn w:val="DefaultParagraphFont"/>
-    <w:link w:val="Heading5"/>
+  <w:style w:type="character" w:customStyle="1" w:styleId="5Char">
+    <w:name w:val="Επικεφαλίδα 5 Char"/>
+    <w:basedOn w:val="a0"/>
+    <w:link w:val="5"/>
     <w:uiPriority w:val="9"/>
     <w:semiHidden/>
     <w:rsid w:val="008E72A7"/>
@@ -6801,10 +7621,10 @@
       <w:color w:val="0F4761" w:themeColor="accent1" w:themeShade="BF"/>
     </w:rPr>
   </w:style>
-  <w:style w:type="character" w:customStyle="1" w:styleId="Heading6Char">
-    <w:name w:val="Heading 6 Char"/>
-    <w:basedOn w:val="DefaultParagraphFont"/>
-    <w:link w:val="Heading6"/>
+  <w:style w:type="character" w:customStyle="1" w:styleId="6Char">
+    <w:name w:val="Επικεφαλίδα 6 Char"/>
+    <w:basedOn w:val="a0"/>
+    <w:link w:val="6"/>
     <w:uiPriority w:val="9"/>
     <w:semiHidden/>
     <w:rsid w:val="008E72A7"/>
@@ -6815,10 +7635,10 @@
       <w:color w:val="595959" w:themeColor="text1" w:themeTint="A6"/>
     </w:rPr>
   </w:style>
-  <w:style w:type="character" w:customStyle="1" w:styleId="Heading7Char">
-    <w:name w:val="Heading 7 Char"/>
-    <w:basedOn w:val="DefaultParagraphFont"/>
-    <w:link w:val="Heading7"/>
+  <w:style w:type="character" w:customStyle="1" w:styleId="7Char">
+    <w:name w:val="Επικεφαλίδα 7 Char"/>
+    <w:basedOn w:val="a0"/>
+    <w:link w:val="7"/>
     <w:uiPriority w:val="9"/>
     <w:semiHidden/>
     <w:rsid w:val="008E72A7"/>
@@ -6827,10 +7647,10 @@
       <w:color w:val="595959" w:themeColor="text1" w:themeTint="A6"/>
     </w:rPr>
   </w:style>
-  <w:style w:type="character" w:customStyle="1" w:styleId="Heading8Char">
-    <w:name w:val="Heading 8 Char"/>
-    <w:basedOn w:val="DefaultParagraphFont"/>
-    <w:link w:val="Heading8"/>
+  <w:style w:type="character" w:customStyle="1" w:styleId="8Char">
+    <w:name w:val="Επικεφαλίδα 8 Char"/>
+    <w:basedOn w:val="a0"/>
+    <w:link w:val="8"/>
     <w:uiPriority w:val="9"/>
     <w:semiHidden/>
     <w:rsid w:val="008E72A7"/>
@@ -6841,10 +7661,10 @@
       <w:color w:val="272727" w:themeColor="text1" w:themeTint="D8"/>
     </w:rPr>
   </w:style>
-  <w:style w:type="character" w:customStyle="1" w:styleId="Heading9Char">
-    <w:name w:val="Heading 9 Char"/>
-    <w:basedOn w:val="DefaultParagraphFont"/>
-    <w:link w:val="Heading9"/>
+  <w:style w:type="character" w:customStyle="1" w:styleId="9Char">
+    <w:name w:val="Επικεφαλίδα 9 Char"/>
+    <w:basedOn w:val="a0"/>
+    <w:link w:val="9"/>
     <w:uiPriority w:val="9"/>
     <w:semiHidden/>
     <w:rsid w:val="008E72A7"/>
@@ -6853,11 +7673,11 @@
       <w:color w:val="272727" w:themeColor="text1" w:themeTint="D8"/>
     </w:rPr>
   </w:style>
-  <w:style w:type="paragraph" w:styleId="Title">
+  <w:style w:type="paragraph" w:styleId="a3">
     <w:name w:val="Title"/>
-    <w:basedOn w:val="Normal"/>
-    <w:next w:val="Normal"/>
-    <w:link w:val="TitleChar"/>
+    <w:basedOn w:val="a"/>
+    <w:next w:val="a"/>
+    <w:link w:val="Char"/>
     <w:uiPriority w:val="10"/>
     <w:qFormat/>
     <w:rsid w:val="008E72A7"/>
@@ -6873,10 +7693,10 @@
       <w:szCs w:val="56"/>
     </w:rPr>
   </w:style>
-  <w:style w:type="character" w:customStyle="1" w:styleId="TitleChar">
-    <w:name w:val="Title Char"/>
-    <w:basedOn w:val="DefaultParagraphFont"/>
-    <w:link w:val="Title"/>
+  <w:style w:type="character" w:customStyle="1" w:styleId="Char">
+    <w:name w:val="Τίτλος Char"/>
+    <w:basedOn w:val="a0"/>
+    <w:link w:val="a3"/>
     <w:uiPriority w:val="10"/>
     <w:rsid w:val="008E72A7"/>
     <w:rPr>
@@ -6887,11 +7707,11 @@
       <w:szCs w:val="56"/>
     </w:rPr>
   </w:style>
-  <w:style w:type="paragraph" w:styleId="Subtitle">
+  <w:style w:type="paragraph" w:styleId="a4">
     <w:name w:val="Subtitle"/>
-    <w:basedOn w:val="Normal"/>
-    <w:next w:val="Normal"/>
-    <w:link w:val="SubtitleChar"/>
+    <w:basedOn w:val="a"/>
+    <w:next w:val="a"/>
+    <w:link w:val="Char0"/>
     <w:uiPriority w:val="11"/>
     <w:qFormat/>
     <w:rsid w:val="008E72A7"/>
@@ -6908,10 +7728,10 @@
       <w:szCs w:val="28"/>
     </w:rPr>
   </w:style>
-  <w:style w:type="character" w:customStyle="1" w:styleId="SubtitleChar">
-    <w:name w:val="Subtitle Char"/>
-    <w:basedOn w:val="DefaultParagraphFont"/>
-    <w:link w:val="Subtitle"/>
+  <w:style w:type="character" w:customStyle="1" w:styleId="Char0">
+    <w:name w:val="Υπότιτλος Char"/>
+    <w:basedOn w:val="a0"/>
+    <w:link w:val="a4"/>
     <w:uiPriority w:val="11"/>
     <w:rsid w:val="008E72A7"/>
     <w:rPr>
@@ -6922,11 +7742,11 @@
       <w:szCs w:val="28"/>
     </w:rPr>
   </w:style>
-  <w:style w:type="paragraph" w:styleId="Quote">
+  <w:style w:type="paragraph" w:styleId="a5">
     <w:name w:val="Quote"/>
-    <w:basedOn w:val="Normal"/>
-    <w:next w:val="Normal"/>
-    <w:link w:val="QuoteChar"/>
+    <w:basedOn w:val="a"/>
+    <w:next w:val="a"/>
+    <w:link w:val="Char1"/>
     <w:uiPriority w:val="29"/>
     <w:qFormat/>
     <w:rsid w:val="008E72A7"/>
@@ -6940,10 +7760,10 @@
       <w:color w:val="404040" w:themeColor="text1" w:themeTint="BF"/>
     </w:rPr>
   </w:style>
-  <w:style w:type="character" w:customStyle="1" w:styleId="QuoteChar">
-    <w:name w:val="Quote Char"/>
-    <w:basedOn w:val="DefaultParagraphFont"/>
-    <w:link w:val="Quote"/>
+  <w:style w:type="character" w:customStyle="1" w:styleId="Char1">
+    <w:name w:val="Απόσπασμα Char"/>
+    <w:basedOn w:val="a0"/>
+    <w:link w:val="a5"/>
     <w:uiPriority w:val="29"/>
     <w:rsid w:val="008E72A7"/>
     <w:rPr>
@@ -6952,9 +7772,9 @@
       <w:color w:val="404040" w:themeColor="text1" w:themeTint="BF"/>
     </w:rPr>
   </w:style>
-  <w:style w:type="paragraph" w:styleId="ListParagraph">
+  <w:style w:type="paragraph" w:styleId="a6">
     <w:name w:val="List Paragraph"/>
-    <w:basedOn w:val="Normal"/>
+    <w:basedOn w:val="a"/>
     <w:uiPriority w:val="34"/>
     <w:qFormat/>
     <w:rsid w:val="008E72A7"/>
@@ -6963,9 +7783,9 @@
       <w:contextualSpacing/>
     </w:pPr>
   </w:style>
-  <w:style w:type="character" w:styleId="IntenseEmphasis">
+  <w:style w:type="character" w:styleId="a7">
     <w:name w:val="Intense Emphasis"/>
-    <w:basedOn w:val="DefaultParagraphFont"/>
+    <w:basedOn w:val="a0"/>
     <w:uiPriority w:val="21"/>
     <w:qFormat/>
     <w:rsid w:val="008E72A7"/>
@@ -6975,11 +7795,11 @@
       <w:color w:val="0F4761" w:themeColor="accent1" w:themeShade="BF"/>
     </w:rPr>
   </w:style>
-  <w:style w:type="paragraph" w:styleId="IntenseQuote">
+  <w:style w:type="paragraph" w:styleId="a8">
     <w:name w:val="Intense Quote"/>
-    <w:basedOn w:val="Normal"/>
-    <w:next w:val="Normal"/>
-    <w:link w:val="IntenseQuoteChar"/>
+    <w:basedOn w:val="a"/>
+    <w:next w:val="a"/>
+    <w:link w:val="Char2"/>
     <w:uiPriority w:val="30"/>
     <w:qFormat/>
     <w:rsid w:val="008E72A7"/>
@@ -6998,10 +7818,10 @@
       <w:color w:val="0F4761" w:themeColor="accent1" w:themeShade="BF"/>
     </w:rPr>
   </w:style>
-  <w:style w:type="character" w:customStyle="1" w:styleId="IntenseQuoteChar">
-    <w:name w:val="Intense Quote Char"/>
-    <w:basedOn w:val="DefaultParagraphFont"/>
-    <w:link w:val="IntenseQuote"/>
+  <w:style w:type="character" w:customStyle="1" w:styleId="Char2">
+    <w:name w:val="Έντονο απόσπ. Char"/>
+    <w:basedOn w:val="a0"/>
+    <w:link w:val="a8"/>
     <w:uiPriority w:val="30"/>
     <w:rsid w:val="008E72A7"/>
     <w:rPr>
@@ -7010,9 +7830,9 @@
       <w:color w:val="0F4761" w:themeColor="accent1" w:themeShade="BF"/>
     </w:rPr>
   </w:style>
-  <w:style w:type="character" w:styleId="IntenseReference">
+  <w:style w:type="character" w:styleId="a9">
     <w:name w:val="Intense Reference"/>
-    <w:basedOn w:val="DefaultParagraphFont"/>
+    <w:basedOn w:val="a0"/>
     <w:uiPriority w:val="32"/>
     <w:qFormat/>
     <w:rsid w:val="008E72A7"/>
@@ -7024,9 +7844,9 @@
       <w:spacing w:val="5"/>
     </w:rPr>
   </w:style>
-  <w:style w:type="character" w:styleId="Hyperlink">
+  <w:style w:type="character" w:styleId="-">
     <w:name w:val="Hyperlink"/>
-    <w:basedOn w:val="DefaultParagraphFont"/>
+    <w:basedOn w:val="a0"/>
     <w:uiPriority w:val="99"/>
     <w:unhideWhenUsed/>
     <w:rsid w:val="00D84C91"/>
@@ -7035,9 +7855,9 @@
       <w:u w:val="single"/>
     </w:rPr>
   </w:style>
-  <w:style w:type="character" w:styleId="UnresolvedMention">
+  <w:style w:type="character" w:styleId="aa">
     <w:name w:val="Unresolved Mention"/>
-    <w:basedOn w:val="DefaultParagraphFont"/>
+    <w:basedOn w:val="a0"/>
     <w:uiPriority w:val="99"/>
     <w:semiHidden/>
     <w:unhideWhenUsed/>
@@ -7047,9 +7867,9 @@
       <w:shd w:val="clear" w:color="auto" w:fill="E1DFDD"/>
     </w:rPr>
   </w:style>
-  <w:style w:type="paragraph" w:styleId="NormalWeb">
+  <w:style w:type="paragraph" w:styleId="Web">
     <w:name w:val="Normal (Web)"/>
-    <w:basedOn w:val="Normal"/>
+    <w:basedOn w:val="a"/>
     <w:uiPriority w:val="99"/>
     <w:semiHidden/>
     <w:unhideWhenUsed/>
@@ -7058,9 +7878,9 @@
       <w:rFonts w:ascii="Times New Roman" w:hAnsi="Times New Roman" w:cs="Times New Roman"/>
     </w:rPr>
   </w:style>
-  <w:style w:type="character" w:styleId="FollowedHyperlink">
+  <w:style w:type="character" w:styleId="-0">
     <w:name w:val="FollowedHyperlink"/>
-    <w:basedOn w:val="DefaultParagraphFont"/>
+    <w:basedOn w:val="a0"/>
     <w:uiPriority w:val="99"/>
     <w:semiHidden/>
     <w:unhideWhenUsed/>

</xml_diff>

<commit_message>
hitbox colors and report
</commit_message>
<xml_diff>
--- a/Project Report.docx
+++ b/Project Report.docx
@@ -1,6 +1,6 @@
 
 <file path=word/document.xml><?xml version="1.0" encoding="utf-8"?>
-<w:document xmlns:wpc="http://schemas.microsoft.com/office/word/2010/wordprocessingCanvas" xmlns:cx="http://schemas.microsoft.com/office/drawing/2014/chartex" xmlns:cx1="http://schemas.microsoft.com/office/drawing/2015/9/8/chartex" xmlns:cx2="http://schemas.microsoft.com/office/drawing/2015/10/21/chartex" xmlns:cx3="http://schemas.microsoft.com/office/drawing/2016/5/9/chartex" xmlns:cx4="http://schemas.microsoft.com/office/drawing/2016/5/10/chartex" xmlns:cx5="http://schemas.microsoft.com/office/drawing/2016/5/11/chartex" xmlns:cx6="http://schemas.microsoft.com/office/drawing/2016/5/12/chartex" xmlns:cx7="http://schemas.microsoft.com/office/drawing/2016/5/13/chartex" xmlns:cx8="http://schemas.microsoft.com/office/drawing/2016/5/14/chartex" xmlns:mc="http://schemas.openxmlformats.org/markup-compatibility/2006" xmlns:aink="http://schemas.microsoft.com/office/drawing/2016/ink" xmlns:am3d="http://schemas.microsoft.com/office/drawing/2017/model3d" xmlns:o="urn:schemas-microsoft-com:office:office" xmlns:oel="http://schemas.microsoft.com/office/2019/extlst" xmlns:r="http://schemas.openxmlformats.org/officeDocument/2006/relationships" xmlns:m="http://schemas.openxmlformats.org/officeDocument/2006/math" xmlns:v="urn:schemas-microsoft-com:vml" xmlns:wp14="http://schemas.microsoft.com/office/word/2010/wordprocessingDrawing" xmlns:wp="http://schemas.openxmlformats.org/drawingml/2006/wordprocessingDrawing" xmlns:w10="urn:schemas-microsoft-com:office:word" xmlns:w="http://schemas.openxmlformats.org/wordprocessingml/2006/main" xmlns:w14="http://schemas.microsoft.com/office/word/2010/wordml" xmlns:w15="http://schemas.microsoft.com/office/word/2012/wordml" xmlns:w16cex="http://schemas.microsoft.com/office/word/2018/wordml/cex" xmlns:w16cid="http://schemas.microsoft.com/office/word/2016/wordml/cid" xmlns:w16="http://schemas.microsoft.com/office/word/2018/wordml" xmlns:w16du="http://schemas.microsoft.com/office/word/2023/wordml/word16du" xmlns:w16sdtdh="http://schemas.microsoft.com/office/word/2020/wordml/sdtdatahash" xmlns:w16sdtfl="http://schemas.microsoft.com/office/word/2024/wordml/sdtformatlock" xmlns:w16se="http://schemas.microsoft.com/office/word/2015/wordml/symex" xmlns:wpg="http://schemas.microsoft.com/office/word/2010/wordprocessingGroup" xmlns:wpi="http://schemas.microsoft.com/office/word/2010/wordprocessingInk" xmlns:wne="http://schemas.microsoft.com/office/word/2006/wordml" xmlns:wps="http://schemas.microsoft.com/office/word/2010/wordprocessingShape" mc:Ignorable="w14 w15 w16se w16cid w16 w16cex w16sdtdh w16sdtfl w16du wp14">
+<w:document xmlns:wpc="http://schemas.microsoft.com/office/word/2010/wordprocessingCanvas" xmlns:cx="http://schemas.microsoft.com/office/drawing/2014/chartex" xmlns:cx1="http://schemas.microsoft.com/office/drawing/2015/9/8/chartex" xmlns:cx2="http://schemas.microsoft.com/office/drawing/2015/10/21/chartex" xmlns:cx3="http://schemas.microsoft.com/office/drawing/2016/5/9/chartex" xmlns:cx4="http://schemas.microsoft.com/office/drawing/2016/5/10/chartex" xmlns:cx5="http://schemas.microsoft.com/office/drawing/2016/5/11/chartex" xmlns:cx6="http://schemas.microsoft.com/office/drawing/2016/5/12/chartex" xmlns:cx7="http://schemas.microsoft.com/office/drawing/2016/5/13/chartex" xmlns:cx8="http://schemas.microsoft.com/office/drawing/2016/5/14/chartex" xmlns:mc="http://schemas.openxmlformats.org/markup-compatibility/2006" xmlns:aink="http://schemas.microsoft.com/office/drawing/2016/ink" xmlns:am3d="http://schemas.microsoft.com/office/drawing/2017/model3d" xmlns:o="urn:schemas-microsoft-com:office:office" xmlns:oel="http://schemas.microsoft.com/office/2019/extlst" xmlns:r="http://schemas.openxmlformats.org/officeDocument/2006/relationships" xmlns:m="http://schemas.openxmlformats.org/officeDocument/2006/math" xmlns:v="urn:schemas-microsoft-com:vml" xmlns:wp14="http://schemas.microsoft.com/office/word/2010/wordprocessingDrawing" xmlns:wp="http://schemas.openxmlformats.org/drawingml/2006/wordprocessingDrawing" xmlns:w10="urn:schemas-microsoft-com:office:word" xmlns:w="http://schemas.openxmlformats.org/wordprocessingml/2006/main" xmlns:w14="http://schemas.microsoft.com/office/word/2010/wordml" xmlns:w15="http://schemas.microsoft.com/office/word/2012/wordml" xmlns:w16cex="http://schemas.microsoft.com/office/word/2018/wordml/cex" xmlns:w16cid="http://schemas.microsoft.com/office/word/2016/wordml/cid" xmlns:w16="http://schemas.microsoft.com/office/word/2018/wordml" xmlns:w16du="http://schemas.microsoft.com/office/word/2023/wordml/word16du" xmlns:w16sdtdh="http://schemas.microsoft.com/office/word/2020/wordml/sdtdatahash" xmlns:w16se="http://schemas.microsoft.com/office/word/2015/wordml/symex" xmlns:wpg="http://schemas.microsoft.com/office/word/2010/wordprocessingGroup" xmlns:wpi="http://schemas.microsoft.com/office/word/2010/wordprocessingInk" xmlns:wne="http://schemas.microsoft.com/office/word/2006/wordml" xmlns:wps="http://schemas.microsoft.com/office/word/2010/wordprocessingShape" mc:Ignorable="w14 w15 w16se w16cid w16 w16cex w16sdtdh w16du wp14">
   <w:body>
     <w:p>
       <w:pPr>
@@ -100,7 +100,7 @@
       <w:hyperlink r:id="rId5" w:history="1">
         <w:r>
           <w:rPr>
-            <w:rStyle w:val="-"/>
+            <w:rStyle w:val="Hyperlink"/>
             <w:b/>
             <w:bCs/>
           </w:rPr>
@@ -307,7 +307,23 @@
           <w:b/>
           <w:bCs/>
         </w:rPr>
-        <w:t xml:space="preserve">p5.play: </w:t>
+        <w:t>p</w:t>
+      </w:r>
+      <w:proofErr w:type="gramStart"/>
+      <w:r>
+        <w:rPr>
+          <w:b/>
+          <w:bCs/>
+        </w:rPr>
+        <w:t>5.play</w:t>
+      </w:r>
+      <w:proofErr w:type="gramEnd"/>
+      <w:r>
+        <w:rPr>
+          <w:b/>
+          <w:bCs/>
+        </w:rPr>
+        <w:t xml:space="preserve">: </w:t>
       </w:r>
       <w:r>
         <w:t>Provides additional functionality for sprite managemen</w:t>
@@ -332,7 +348,23 @@
           <w:b/>
           <w:bCs/>
         </w:rPr>
-        <w:t xml:space="preserve">p5.sound: </w:t>
+        <w:t>p</w:t>
+      </w:r>
+      <w:proofErr w:type="gramStart"/>
+      <w:r>
+        <w:rPr>
+          <w:b/>
+          <w:bCs/>
+        </w:rPr>
+        <w:t>5.sound</w:t>
+      </w:r>
+      <w:proofErr w:type="gramEnd"/>
+      <w:r>
+        <w:rPr>
+          <w:b/>
+          <w:bCs/>
+        </w:rPr>
+        <w:t xml:space="preserve">: </w:t>
       </w:r>
       <w:r>
         <w:t>Used for handling sound effects and background music.</w:t>
@@ -625,7 +657,15 @@
         </w:numPr>
       </w:pPr>
       <w:r>
-        <w:t>The game is designed to run in modern web browsers that support HTML5, JavaScript, and the p5.js library.</w:t>
+        <w:t xml:space="preserve">The game is designed to run </w:t>
+      </w:r>
+      <w:proofErr w:type="gramStart"/>
+      <w:r>
+        <w:t>in</w:t>
+      </w:r>
+      <w:proofErr w:type="gramEnd"/>
+      <w:r>
+        <w:t xml:space="preserve"> modern web browsers that support HTML5, JavaScript, and the p5.js library.</w:t>
       </w:r>
     </w:p>
     <w:p>
@@ -698,33 +738,27 @@
           <w:b/>
           <w:bCs/>
         </w:rPr>
+        <w:lastRenderedPageBreak/>
         <w:t xml:space="preserve">Panos Moschos: </w:t>
       </w:r>
       <w:r>
-        <w:t>Implemented player and enemy interactio</w:t>
-      </w:r>
-      <w:r>
-        <w:t>n</w:t>
-      </w:r>
-      <w:r>
-        <w:t>s.</w:t>
-      </w:r>
-    </w:p>
-    <w:p>
-      <w:pPr>
-        <w:rPr>
-          <w:b/>
-          <w:bCs/>
-        </w:rPr>
-      </w:pPr>
-      <w:r>
-        <w:rPr>
-          <w:b/>
-          <w:bCs/>
-        </w:rPr>
-        <w:lastRenderedPageBreak/>
+        <w:t xml:space="preserve">Designed and implemented the core gameplay mechanics involving player and enemy interactions. Created all enemy types, designed their behavior patterns, and implemented their spawn system, ensuring a balanced and engaging challenge. Developed the power-up system, including the logic for spawning and activating power-ups. </w:t>
+      </w:r>
+    </w:p>
+    <w:p>
+      <w:pPr>
+        <w:rPr>
+          <w:b/>
+          <w:bCs/>
+        </w:rPr>
+      </w:pPr>
+      <w:r>
+        <w:rPr>
+          <w:b/>
+          <w:bCs/>
+        </w:rPr>
         <w:pict w14:anchorId="5BAD88A4">
-          <v:rect id="_x0000_i1042" style="width:0;height:1.5pt" o:hralign="center" o:hrstd="t" o:hr="t" fillcolor="#a0a0a0" stroked="f"/>
+          <v:rect id="_x0000_i1028" style="width:0;height:1.5pt" o:hralign="center" o:hrstd="t" o:hr="t" fillcolor="#a0a0a0" stroked="f"/>
         </w:pict>
       </w:r>
     </w:p>
@@ -799,13 +833,7 @@
         <w:t>File</w:t>
       </w:r>
       <w:r>
-        <w:t>: play</w:t>
-      </w:r>
-      <w:r>
-        <w:t>e</w:t>
-      </w:r>
-      <w:r>
-        <w:t>r.js</w:t>
+        <w:t>: player.js</w:t>
       </w:r>
     </w:p>
     <w:p>
@@ -963,7 +991,23 @@
           <w:b/>
           <w:bCs/>
         </w:rPr>
-        <w:t>Power-Ups: Provides temporary enhancements to the player.</w:t>
+        <w:t xml:space="preserve">Power-Ups: Provides temporary enhancements </w:t>
+      </w:r>
+      <w:proofErr w:type="gramStart"/>
+      <w:r>
+        <w:rPr>
+          <w:b/>
+          <w:bCs/>
+        </w:rPr>
+        <w:t>to</w:t>
+      </w:r>
+      <w:proofErr w:type="gramEnd"/>
+      <w:r>
+        <w:rPr>
+          <w:b/>
+          <w:bCs/>
+        </w:rPr>
+        <w:t xml:space="preserve"> the player.</w:t>
       </w:r>
     </w:p>
     <w:p>
@@ -1026,6 +1070,7 @@
           <w:b/>
           <w:bCs/>
         </w:rPr>
+        <w:lastRenderedPageBreak/>
         <w:t>Hearts: Increases player's lives when collected.</w:t>
       </w:r>
     </w:p>
@@ -1063,7 +1108,6 @@
           <w:b/>
           <w:bCs/>
         </w:rPr>
-        <w:lastRenderedPageBreak/>
         <w:t xml:space="preserve">Description: </w:t>
       </w:r>
       <w:r>
@@ -1086,23 +1130,7 @@
           <w:b/>
           <w:bCs/>
         </w:rPr>
-        <w:t xml:space="preserve">Stars: Background elements for visual </w:t>
-      </w:r>
-      <w:proofErr w:type="gramStart"/>
-      <w:r>
-        <w:rPr>
-          <w:b/>
-          <w:bCs/>
-        </w:rPr>
-        <w:t>effect</w:t>
-      </w:r>
-      <w:proofErr w:type="gramEnd"/>
-      <w:r>
-        <w:rPr>
-          <w:b/>
-          <w:bCs/>
-        </w:rPr>
-        <w:t>.</w:t>
+        <w:t>Stars: Background elements for visual effect.</w:t>
       </w:r>
     </w:p>
     <w:p>
@@ -1138,15 +1166,7 @@
         <w:t xml:space="preserve">Description: </w:t>
       </w:r>
       <w:r>
-        <w:t xml:space="preserve">The Star class creates and manages star objects that move in the background, providing a visual effect of a moving </w:t>
-      </w:r>
-      <w:proofErr w:type="gramStart"/>
-      <w:r>
-        <w:t>starfield</w:t>
-      </w:r>
-      <w:proofErr w:type="gramEnd"/>
-      <w:r>
-        <w:t>.</w:t>
+        <w:t>The Star class creates and manages star objects that move in the background, providing a visual effect of a moving starfield.</w:t>
       </w:r>
     </w:p>
     <w:p>
@@ -1365,12 +1385,21 @@
           <w:numId w:val="24"/>
         </w:numPr>
       </w:pPr>
-      <w:r>
-        <w:rPr>
-          <w:b/>
-          <w:bCs/>
-        </w:rPr>
-        <w:t>drawBattleScreen():</w:t>
+      <w:proofErr w:type="gramStart"/>
+      <w:r>
+        <w:rPr>
+          <w:b/>
+          <w:bCs/>
+        </w:rPr>
+        <w:t>drawBattleScreen(</w:t>
+      </w:r>
+      <w:proofErr w:type="gramEnd"/>
+      <w:r>
+        <w:rPr>
+          <w:b/>
+          <w:bCs/>
+        </w:rPr>
+        <w:t>):</w:t>
       </w:r>
       <w:r>
         <w:t xml:space="preserve"> Renders the battle screen and updates game elements.</w:t>
@@ -1383,12 +1412,22 @@
           <w:numId w:val="24"/>
         </w:numPr>
       </w:pPr>
-      <w:r>
-        <w:rPr>
-          <w:b/>
-          <w:bCs/>
-        </w:rPr>
-        <w:t>spawnEnemies(level,</w:t>
+      <w:proofErr w:type="gramStart"/>
+      <w:r>
+        <w:rPr>
+          <w:b/>
+          <w:bCs/>
+        </w:rPr>
+        <w:lastRenderedPageBreak/>
+        <w:t>spawnEnemies(</w:t>
+      </w:r>
+      <w:proofErr w:type="gramEnd"/>
+      <w:r>
+        <w:rPr>
+          <w:b/>
+          <w:bCs/>
+        </w:rPr>
+        <w:t>level,</w:t>
       </w:r>
       <w:r>
         <w:t xml:space="preserve"> </w:t>
@@ -1411,13 +1450,21 @@
           <w:numId w:val="24"/>
         </w:numPr>
       </w:pPr>
-      <w:r>
-        <w:rPr>
-          <w:b/>
-          <w:bCs/>
-        </w:rPr>
-        <w:lastRenderedPageBreak/>
-        <w:t>togglePause():</w:t>
+      <w:proofErr w:type="gramStart"/>
+      <w:r>
+        <w:rPr>
+          <w:b/>
+          <w:bCs/>
+        </w:rPr>
+        <w:t>togglePause(</w:t>
+      </w:r>
+      <w:proofErr w:type="gramEnd"/>
+      <w:r>
+        <w:rPr>
+          <w:b/>
+          <w:bCs/>
+        </w:rPr>
+        <w:t>):</w:t>
       </w:r>
       <w:r>
         <w:t xml:space="preserve"> Toggles the pause state of the game.</w:t>
@@ -1430,12 +1477,21 @@
           <w:numId w:val="24"/>
         </w:numPr>
       </w:pPr>
-      <w:r>
-        <w:rPr>
-          <w:b/>
-          <w:bCs/>
-        </w:rPr>
-        <w:t>gameOverToggle():</w:t>
+      <w:proofErr w:type="gramStart"/>
+      <w:r>
+        <w:rPr>
+          <w:b/>
+          <w:bCs/>
+        </w:rPr>
+        <w:t>gameOverToggle(</w:t>
+      </w:r>
+      <w:proofErr w:type="gramEnd"/>
+      <w:r>
+        <w:rPr>
+          <w:b/>
+          <w:bCs/>
+        </w:rPr>
+        <w:t>):</w:t>
       </w:r>
       <w:r>
         <w:t xml:space="preserve"> Handles game over logic.</w:t>
@@ -1484,12 +1540,21 @@
           <w:numId w:val="24"/>
         </w:numPr>
       </w:pPr>
-      <w:r>
-        <w:rPr>
-          <w:b/>
-          <w:bCs/>
-        </w:rPr>
-        <w:t>handleLevelCompleteSelection():</w:t>
+      <w:proofErr w:type="gramStart"/>
+      <w:r>
+        <w:rPr>
+          <w:b/>
+          <w:bCs/>
+        </w:rPr>
+        <w:t>handleLevelCompleteSelection(</w:t>
+      </w:r>
+      <w:proofErr w:type="gramEnd"/>
+      <w:r>
+        <w:rPr>
+          <w:b/>
+          <w:bCs/>
+        </w:rPr>
+        <w:t>):</w:t>
       </w:r>
       <w:r>
         <w:t xml:space="preserve"> Handles user input in the level complete menu.</w:t>
@@ -1545,7 +1610,7 @@
       <w:hyperlink r:id="rId6" w:history="1">
         <w:r>
           <w:rPr>
-            <w:rStyle w:val="-"/>
+            <w:rStyle w:val="Hyperlink"/>
             <w:b/>
             <w:bCs/>
           </w:rPr>
@@ -1567,17 +1632,27 @@
       <w:hyperlink r:id="rId7" w:history="1">
         <w:r>
           <w:rPr>
-            <w:rStyle w:val="-"/>
+            <w:rStyle w:val="Hyperlink"/>
             <w:b/>
             <w:bCs/>
           </w:rPr>
-          <w:t>p5.play</w:t>
+          <w:t>p</w:t>
         </w:r>
+        <w:proofErr w:type="gramStart"/>
+        <w:r>
+          <w:rPr>
+            <w:rStyle w:val="Hyperlink"/>
+            <w:b/>
+            <w:bCs/>
+          </w:rPr>
+          <w:t>5.play</w:t>
+        </w:r>
+        <w:proofErr w:type="gramEnd"/>
       </w:hyperlink>
     </w:p>
     <w:p>
       <w:pPr>
-        <w:pStyle w:val="Web"/>
+        <w:pStyle w:val="NormalWeb"/>
         <w:numPr>
           <w:ilvl w:val="0"/>
           <w:numId w:val="25"/>
@@ -1591,13 +1666,24 @@
       <w:hyperlink r:id="rId8" w:anchor="/libraries/p5.sound" w:history="1">
         <w:r>
           <w:rPr>
-            <w:rStyle w:val="-"/>
+            <w:rStyle w:val="Hyperlink"/>
             <w:rFonts w:asciiTheme="minorHAnsi" w:hAnsiTheme="minorHAnsi"/>
             <w:b/>
             <w:bCs/>
           </w:rPr>
-          <w:t>p5.sound</w:t>
+          <w:t>p</w:t>
         </w:r>
+        <w:proofErr w:type="gramStart"/>
+        <w:r>
+          <w:rPr>
+            <w:rStyle w:val="Hyperlink"/>
+            <w:rFonts w:asciiTheme="minorHAnsi" w:hAnsiTheme="minorHAnsi"/>
+            <w:b/>
+            <w:bCs/>
+          </w:rPr>
+          <w:t>5.sound</w:t>
+        </w:r>
+        <w:proofErr w:type="gramEnd"/>
       </w:hyperlink>
     </w:p>
     <w:p>
@@ -1728,43 +1814,66 @@
           <w:sz w:val="28"/>
           <w:szCs w:val="28"/>
         </w:rPr>
-        <w:t>Problem 1: Collision Detection</w:t>
-      </w:r>
-    </w:p>
-    <w:p>
-      <w:pPr>
-        <w:numPr>
-          <w:ilvl w:val="0"/>
-          <w:numId w:val="27"/>
-        </w:numPr>
-      </w:pPr>
-      <w:r>
-        <w:rPr>
-          <w:b/>
-          <w:bCs/>
-        </w:rPr>
-        <w:t xml:space="preserve">Issue: </w:t>
-      </w:r>
-      <w:r>
-        <w:t>Difficulty in accurately detecting collisions between bullets and enemies.</w:t>
-      </w:r>
-    </w:p>
-    <w:p>
-      <w:pPr>
-        <w:numPr>
-          <w:ilvl w:val="0"/>
-          <w:numId w:val="27"/>
-        </w:numPr>
-      </w:pPr>
-      <w:r>
-        <w:rPr>
-          <w:b/>
-          <w:bCs/>
-        </w:rPr>
-        <w:t xml:space="preserve">Resolution: </w:t>
-      </w:r>
-      <w:r>
-        <w:t>Implemented a hitbox padding to adjust the collision detection area.</w:t>
+        <w:t>Problem 1: Collision Detection and Enemy Spawn Overlap</w:t>
+      </w:r>
+    </w:p>
+    <w:p>
+      <w:pPr>
+        <w:rPr>
+          <w:b/>
+          <w:bCs/>
+          <w:sz w:val="28"/>
+          <w:szCs w:val="28"/>
+        </w:rPr>
+      </w:pPr>
+      <w:r>
+        <w:rPr>
+          <w:b/>
+          <w:bCs/>
+        </w:rPr>
+        <w:t xml:space="preserve">• Issue: </w:t>
+      </w:r>
+      <w:r>
+        <w:t>Initially, collisions between bullets and enemies were inconsistent, leading to scenarios where bullets visually appeared to hit enemies but were not registered as hits. Additionally, enemy spawn patterns occasionally caused overlapping enemies, breaking the intended game balance and visual clarity.</w:t>
+      </w:r>
+    </w:p>
+    <w:p>
+      <w:pPr>
+        <w:rPr>
+          <w:b/>
+          <w:bCs/>
+          <w:sz w:val="28"/>
+          <w:szCs w:val="28"/>
+        </w:rPr>
+      </w:pPr>
+    </w:p>
+    <w:p>
+      <w:r>
+        <w:rPr>
+          <w:b/>
+          <w:bCs/>
+        </w:rPr>
+        <w:lastRenderedPageBreak/>
+        <w:t xml:space="preserve">• </w:t>
+      </w:r>
+      <w:r>
+        <w:rPr>
+          <w:b/>
+          <w:bCs/>
+        </w:rPr>
+        <w:t>Resolution</w:t>
+      </w:r>
+      <w:r>
+        <w:rPr>
+          <w:b/>
+          <w:bCs/>
+          <w:sz w:val="28"/>
+          <w:szCs w:val="28"/>
+        </w:rPr>
+        <w:t xml:space="preserve">: </w:t>
+      </w:r>
+      <w:r>
+        <w:t>Implemented a refined hitbox system with adjustable padding to accurately align collision detection with the visual representations of enemies and bullets. Designed a spawn algorithm to ensure enemies spawn at distinct locations without overlapping while maintaining the intended challenge level and variety in enemy patterns. Extensively tested and iterated on both solutions to optimize gameplay smoothness and fairness.</w:t>
       </w:r>
     </w:p>
     <w:p>
@@ -1801,11 +1910,7 @@
         <w:t>Issue</w:t>
       </w:r>
       <w:r>
-        <w:t xml:space="preserve">: In the winning screen, I wanted to combine the winning sound and then play the menu sound after a delay. The problem arose when the player </w:t>
-      </w:r>
-      <w:r>
-        <w:lastRenderedPageBreak/>
-        <w:t>went back to the map before the menu sound played; because of the delay, the menu sound would accidentally play at the map screen.</w:t>
+        <w:t>: In the winning screen, I wanted to combine the winning sound and then play the menu sound after a delay. The problem arose when the player went back to the map before the menu sound played; because of the delay, the menu sound would accidentally play at the map screen.</w:t>
       </w:r>
     </w:p>
     <w:p>
@@ -1926,7 +2031,7 @@
     </w:p>
     <w:p>
       <w:pPr>
-        <w:pStyle w:val="a6"/>
+        <w:pStyle w:val="ListParagraph"/>
         <w:numPr>
           <w:ilvl w:val="0"/>
           <w:numId w:val="29"/>
@@ -1955,7 +2060,7 @@
       <w:hyperlink r:id="rId9" w:tgtFrame="_new" w:history="1">
         <w:r>
           <w:rPr>
-            <w:rStyle w:val="-"/>
+            <w:rStyle w:val="Hyperlink"/>
           </w:rPr>
           <w:t>Doodle Menu-Like Song</w:t>
         </w:r>
@@ -1963,7 +2068,7 @@
     </w:p>
     <w:p>
       <w:pPr>
-        <w:pStyle w:val="a6"/>
+        <w:pStyle w:val="ListParagraph"/>
         <w:numPr>
           <w:ilvl w:val="0"/>
           <w:numId w:val="29"/>
@@ -1989,7 +2094,7 @@
       <w:hyperlink r:id="rId10" w:tgtFrame="_new" w:history="1">
         <w:r>
           <w:rPr>
-            <w:rStyle w:val="-"/>
+            <w:rStyle w:val="Hyperlink"/>
           </w:rPr>
           <w:t>freesound_community</w:t>
         </w:r>
@@ -2000,7 +2105,7 @@
       <w:hyperlink r:id="rId11" w:tgtFrame="_new" w:history="1">
         <w:r>
           <w:rPr>
-            <w:rStyle w:val="-"/>
+            <w:rStyle w:val="Hyperlink"/>
           </w:rPr>
           <w:t>Pixabay</w:t>
         </w:r>
@@ -2008,7 +2113,7 @@
     </w:p>
     <w:p>
       <w:pPr>
-        <w:pStyle w:val="a6"/>
+        <w:pStyle w:val="ListParagraph"/>
         <w:numPr>
           <w:ilvl w:val="0"/>
           <w:numId w:val="29"/>
@@ -2034,7 +2139,7 @@
       <w:hyperlink r:id="rId12" w:tgtFrame="_new" w:history="1">
         <w:r>
           <w:rPr>
-            <w:rStyle w:val="-"/>
+            <w:rStyle w:val="Hyperlink"/>
           </w:rPr>
           <w:t>Jurij</w:t>
         </w:r>
@@ -2045,7 +2150,7 @@
       <w:hyperlink r:id="rId13" w:tgtFrame="_new" w:history="1">
         <w:r>
           <w:rPr>
-            <w:rStyle w:val="-"/>
+            <w:rStyle w:val="Hyperlink"/>
           </w:rPr>
           <w:t>Pixabay</w:t>
         </w:r>
@@ -2053,7 +2158,7 @@
     </w:p>
     <w:p>
       <w:pPr>
-        <w:pStyle w:val="a6"/>
+        <w:pStyle w:val="ListParagraph"/>
         <w:numPr>
           <w:ilvl w:val="0"/>
           <w:numId w:val="29"/>
@@ -2076,7 +2181,7 @@
       <w:hyperlink r:id="rId14" w:tgtFrame="_new" w:history="1">
         <w:r>
           <w:rPr>
-            <w:rStyle w:val="-"/>
+            <w:rStyle w:val="Hyperlink"/>
           </w:rPr>
           <w:t>Game Over Bad Chest SFX</w:t>
         </w:r>
@@ -2084,7 +2189,7 @@
     </w:p>
     <w:p>
       <w:pPr>
-        <w:pStyle w:val="a6"/>
+        <w:pStyle w:val="ListParagraph"/>
         <w:numPr>
           <w:ilvl w:val="0"/>
           <w:numId w:val="29"/>
@@ -2110,7 +2215,7 @@
       <w:hyperlink r:id="rId15" w:tgtFrame="_new" w:history="1">
         <w:r>
           <w:rPr>
-            <w:rStyle w:val="-"/>
+            <w:rStyle w:val="Hyperlink"/>
           </w:rPr>
           <w:t>freesound_community</w:t>
         </w:r>
@@ -2121,7 +2226,7 @@
       <w:hyperlink r:id="rId16" w:tgtFrame="_new" w:history="1">
         <w:r>
           <w:rPr>
-            <w:rStyle w:val="-"/>
+            <w:rStyle w:val="Hyperlink"/>
           </w:rPr>
           <w:t>Pixabay</w:t>
         </w:r>
@@ -2129,7 +2234,7 @@
     </w:p>
     <w:p>
       <w:pPr>
-        <w:pStyle w:val="a6"/>
+        <w:pStyle w:val="ListParagraph"/>
         <w:numPr>
           <w:ilvl w:val="0"/>
           <w:numId w:val="29"/>
@@ -2144,6 +2249,7 @@
           <w:b/>
           <w:bCs/>
         </w:rPr>
+        <w:lastRenderedPageBreak/>
         <w:t>Heart Icon:</w:t>
       </w:r>
       <w:r>
@@ -2152,7 +2258,7 @@
       <w:hyperlink r:id="rId17" w:tgtFrame="_new" w:history="1">
         <w:r>
           <w:rPr>
-            <w:rStyle w:val="-"/>
+            <w:rStyle w:val="Hyperlink"/>
           </w:rPr>
           <w:t>Heart Icon</w:t>
         </w:r>
@@ -2160,7 +2266,7 @@
     </w:p>
     <w:p>
       <w:pPr>
-        <w:pStyle w:val="a6"/>
+        <w:pStyle w:val="ListParagraph"/>
         <w:numPr>
           <w:ilvl w:val="0"/>
           <w:numId w:val="29"/>
@@ -2180,35 +2286,23 @@
     </w:p>
     <w:p>
       <w:pPr>
-        <w:pStyle w:val="a6"/>
-        <w:rPr>
-          <w:rStyle w:val="-"/>
+        <w:pStyle w:val="ListParagraph"/>
+        <w:rPr>
+          <w:rStyle w:val="Hyperlink"/>
         </w:rPr>
       </w:pPr>
       <w:hyperlink r:id="rId18" w:tgtFrame="_new" w:history="1">
         <w:r>
           <w:rPr>
-            <w:rStyle w:val="-"/>
+            <w:rStyle w:val="Hyperlink"/>
           </w:rPr>
-          <w:t>Battle Backgroun</w:t>
-        </w:r>
-        <w:r>
-          <w:rPr>
-            <w:rStyle w:val="-"/>
-          </w:rPr>
-          <w:t>d</w:t>
-        </w:r>
-        <w:r>
-          <w:rPr>
-            <w:rStyle w:val="-"/>
-          </w:rPr>
-          <w:t xml:space="preserve"> Image</w:t>
+          <w:t>Battle Background Image</w:t>
         </w:r>
       </w:hyperlink>
     </w:p>
     <w:p>
       <w:pPr>
-        <w:pStyle w:val="a6"/>
+        <w:pStyle w:val="ListParagraph"/>
         <w:numPr>
           <w:ilvl w:val="0"/>
           <w:numId w:val="29"/>
@@ -2235,43 +2329,25 @@
     </w:p>
     <w:p>
       <w:pPr>
-        <w:pStyle w:val="a6"/>
-        <w:rPr>
-          <w:rStyle w:val="-"/>
+        <w:pStyle w:val="ListParagraph"/>
+        <w:rPr>
+          <w:rStyle w:val="Hyperlink"/>
         </w:rPr>
       </w:pPr>
       <w:hyperlink r:id="rId19" w:tgtFrame="_new" w:history="1">
         <w:r>
           <w:rPr>
-            <w:rStyle w:val="-"/>
+            <w:rStyle w:val="Hyperlink"/>
           </w:rPr>
-          <w:t>Map</w:t>
-        </w:r>
-        <w:r>
-          <w:rPr>
-            <w:rStyle w:val="-"/>
-          </w:rPr>
-          <w:t xml:space="preserve"> Backgroun</w:t>
-        </w:r>
-        <w:r>
-          <w:rPr>
-            <w:rStyle w:val="-"/>
-          </w:rPr>
-          <w:t>d</w:t>
-        </w:r>
-        <w:r>
-          <w:rPr>
-            <w:rStyle w:val="-"/>
-          </w:rPr>
-          <w:t xml:space="preserve"> Image</w:t>
+          <w:t>Map Background Image</w:t>
         </w:r>
       </w:hyperlink>
     </w:p>
     <w:p>
       <w:pPr>
-        <w:pStyle w:val="a6"/>
-        <w:rPr>
-          <w:rStyle w:val="-"/>
+        <w:pStyle w:val="ListParagraph"/>
+        <w:rPr>
+          <w:rStyle w:val="Hyperlink"/>
         </w:rPr>
       </w:pPr>
     </w:p>
@@ -2320,7 +2396,7 @@
 </file>
 
 <file path=word/numbering.xml><?xml version="1.0" encoding="utf-8"?>
-<w:numbering xmlns:wpc="http://schemas.microsoft.com/office/word/2010/wordprocessingCanvas" xmlns:cx="http://schemas.microsoft.com/office/drawing/2014/chartex" xmlns:cx1="http://schemas.microsoft.com/office/drawing/2015/9/8/chartex" xmlns:cx2="http://schemas.microsoft.com/office/drawing/2015/10/21/chartex" xmlns:cx3="http://schemas.microsoft.com/office/drawing/2016/5/9/chartex" xmlns:cx4="http://schemas.microsoft.com/office/drawing/2016/5/10/chartex" xmlns:cx5="http://schemas.microsoft.com/office/drawing/2016/5/11/chartex" xmlns:cx6="http://schemas.microsoft.com/office/drawing/2016/5/12/chartex" xmlns:cx7="http://schemas.microsoft.com/office/drawing/2016/5/13/chartex" xmlns:cx8="http://schemas.microsoft.com/office/drawing/2016/5/14/chartex" xmlns:mc="http://schemas.openxmlformats.org/markup-compatibility/2006" xmlns:aink="http://schemas.microsoft.com/office/drawing/2016/ink" xmlns:am3d="http://schemas.microsoft.com/office/drawing/2017/model3d" xmlns:o="urn:schemas-microsoft-com:office:office" xmlns:oel="http://schemas.microsoft.com/office/2019/extlst" xmlns:r="http://schemas.openxmlformats.org/officeDocument/2006/relationships" xmlns:m="http://schemas.openxmlformats.org/officeDocument/2006/math" xmlns:v="urn:schemas-microsoft-com:vml" xmlns:wp14="http://schemas.microsoft.com/office/word/2010/wordprocessingDrawing" xmlns:wp="http://schemas.openxmlformats.org/drawingml/2006/wordprocessingDrawing" xmlns:w10="urn:schemas-microsoft-com:office:word" xmlns:w="http://schemas.openxmlformats.org/wordprocessingml/2006/main" xmlns:w14="http://schemas.microsoft.com/office/word/2010/wordml" xmlns:w15="http://schemas.microsoft.com/office/word/2012/wordml" xmlns:w16cex="http://schemas.microsoft.com/office/word/2018/wordml/cex" xmlns:w16cid="http://schemas.microsoft.com/office/word/2016/wordml/cid" xmlns:w16="http://schemas.microsoft.com/office/word/2018/wordml" xmlns:w16du="http://schemas.microsoft.com/office/word/2023/wordml/word16du" xmlns:w16sdtdh="http://schemas.microsoft.com/office/word/2020/wordml/sdtdatahash" xmlns:w16sdtfl="http://schemas.microsoft.com/office/word/2024/wordml/sdtformatlock" xmlns:w16se="http://schemas.microsoft.com/office/word/2015/wordml/symex" xmlns:wpg="http://schemas.microsoft.com/office/word/2010/wordprocessingGroup" xmlns:wpi="http://schemas.microsoft.com/office/word/2010/wordprocessingInk" xmlns:wne="http://schemas.microsoft.com/office/word/2006/wordml" xmlns:wps="http://schemas.microsoft.com/office/word/2010/wordprocessingShape" mc:Ignorable="w14 w15 w16se w16cid w16 w16cex w16sdtdh w16sdtfl w16du wp14">
+<w:numbering xmlns:wpc="http://schemas.microsoft.com/office/word/2010/wordprocessingCanvas" xmlns:cx="http://schemas.microsoft.com/office/drawing/2014/chartex" xmlns:cx1="http://schemas.microsoft.com/office/drawing/2015/9/8/chartex" xmlns:cx2="http://schemas.microsoft.com/office/drawing/2015/10/21/chartex" xmlns:cx3="http://schemas.microsoft.com/office/drawing/2016/5/9/chartex" xmlns:cx4="http://schemas.microsoft.com/office/drawing/2016/5/10/chartex" xmlns:cx5="http://schemas.microsoft.com/office/drawing/2016/5/11/chartex" xmlns:cx6="http://schemas.microsoft.com/office/drawing/2016/5/12/chartex" xmlns:cx7="http://schemas.microsoft.com/office/drawing/2016/5/13/chartex" xmlns:cx8="http://schemas.microsoft.com/office/drawing/2016/5/14/chartex" xmlns:mc="http://schemas.openxmlformats.org/markup-compatibility/2006" xmlns:aink="http://schemas.microsoft.com/office/drawing/2016/ink" xmlns:am3d="http://schemas.microsoft.com/office/drawing/2017/model3d" xmlns:o="urn:schemas-microsoft-com:office:office" xmlns:oel="http://schemas.microsoft.com/office/2019/extlst" xmlns:r="http://schemas.openxmlformats.org/officeDocument/2006/relationships" xmlns:m="http://schemas.openxmlformats.org/officeDocument/2006/math" xmlns:v="urn:schemas-microsoft-com:vml" xmlns:wp14="http://schemas.microsoft.com/office/word/2010/wordprocessingDrawing" xmlns:wp="http://schemas.openxmlformats.org/drawingml/2006/wordprocessingDrawing" xmlns:w10="urn:schemas-microsoft-com:office:word" xmlns:w="http://schemas.openxmlformats.org/wordprocessingml/2006/main" xmlns:w14="http://schemas.microsoft.com/office/word/2010/wordml" xmlns:w15="http://schemas.microsoft.com/office/word/2012/wordml" xmlns:w16cex="http://schemas.microsoft.com/office/word/2018/wordml/cex" xmlns:w16cid="http://schemas.microsoft.com/office/word/2016/wordml/cid" xmlns:w16="http://schemas.microsoft.com/office/word/2018/wordml" xmlns:w16du="http://schemas.microsoft.com/office/word/2023/wordml/word16du" xmlns:w16sdtdh="http://schemas.microsoft.com/office/word/2020/wordml/sdtdatahash" xmlns:w16se="http://schemas.microsoft.com/office/word/2015/wordml/symex" xmlns:wpg="http://schemas.microsoft.com/office/word/2010/wordprocessingGroup" xmlns:wpi="http://schemas.microsoft.com/office/word/2010/wordprocessingInk" xmlns:wne="http://schemas.microsoft.com/office/word/2006/wordml" xmlns:wps="http://schemas.microsoft.com/office/word/2010/wordprocessingShape" mc:Ignorable="w14 w15 w16se w16cid w16 w16cex w16sdtdh w16du wp14">
   <w:abstractNum w:abstractNumId="0" w15:restartNumberingAfterBreak="0">
     <w:nsid w:val="00B4233D"/>
     <w:multiLevelType w:val="multilevel"/>
@@ -6929,7 +7005,7 @@
 </file>
 
 <file path=word/styles.xml><?xml version="1.0" encoding="utf-8"?>
-<w:styles xmlns:mc="http://schemas.openxmlformats.org/markup-compatibility/2006" xmlns:r="http://schemas.openxmlformats.org/officeDocument/2006/relationships" xmlns:w="http://schemas.openxmlformats.org/wordprocessingml/2006/main" xmlns:w14="http://schemas.microsoft.com/office/word/2010/wordml" xmlns:w15="http://schemas.microsoft.com/office/word/2012/wordml" xmlns:w16cex="http://schemas.microsoft.com/office/word/2018/wordml/cex" xmlns:w16cid="http://schemas.microsoft.com/office/word/2016/wordml/cid" xmlns:w16="http://schemas.microsoft.com/office/word/2018/wordml" xmlns:w16du="http://schemas.microsoft.com/office/word/2023/wordml/word16du" xmlns:w16sdtdh="http://schemas.microsoft.com/office/word/2020/wordml/sdtdatahash" xmlns:w16sdtfl="http://schemas.microsoft.com/office/word/2024/wordml/sdtformatlock" xmlns:w16se="http://schemas.microsoft.com/office/word/2015/wordml/symex" mc:Ignorable="w14 w15 w16se w16cid w16 w16cex w16sdtdh w16sdtfl w16du">
+<w:styles xmlns:mc="http://schemas.openxmlformats.org/markup-compatibility/2006" xmlns:r="http://schemas.openxmlformats.org/officeDocument/2006/relationships" xmlns:w="http://schemas.openxmlformats.org/wordprocessingml/2006/main" xmlns:w14="http://schemas.microsoft.com/office/word/2010/wordml" xmlns:w15="http://schemas.microsoft.com/office/word/2012/wordml" xmlns:w16cex="http://schemas.microsoft.com/office/word/2018/wordml/cex" xmlns:w16cid="http://schemas.microsoft.com/office/word/2016/wordml/cid" xmlns:w16="http://schemas.microsoft.com/office/word/2018/wordml" xmlns:w16du="http://schemas.microsoft.com/office/word/2023/wordml/word16du" xmlns:w16sdtdh="http://schemas.microsoft.com/office/word/2020/wordml/sdtdatahash" xmlns:w16se="http://schemas.microsoft.com/office/word/2015/wordml/symex" mc:Ignorable="w14 w15 w16se w16cid w16 w16cex w16sdtdh w16du">
   <w:docDefaults>
     <w:rPrDefault>
       <w:rPr>
@@ -7325,15 +7401,15 @@
     <w:lsdException w:name="Unresolved Mention" w:semiHidden="1" w:unhideWhenUsed="1"/>
     <w:lsdException w:name="Smart Link" w:semiHidden="1" w:unhideWhenUsed="1"/>
   </w:latentStyles>
-  <w:style w:type="paragraph" w:default="1" w:styleId="a">
+  <w:style w:type="paragraph" w:default="1" w:styleId="Normal">
     <w:name w:val="Normal"/>
     <w:qFormat/>
   </w:style>
-  <w:style w:type="paragraph" w:styleId="1">
+  <w:style w:type="paragraph" w:styleId="Heading1">
     <w:name w:val="heading 1"/>
-    <w:basedOn w:val="a"/>
-    <w:next w:val="a"/>
-    <w:link w:val="1Char"/>
+    <w:basedOn w:val="Normal"/>
+    <w:next w:val="Normal"/>
+    <w:link w:val="Heading1Char"/>
     <w:uiPriority w:val="9"/>
     <w:qFormat/>
     <w:rsid w:val="008E72A7"/>
@@ -7350,11 +7426,11 @@
       <w:szCs w:val="40"/>
     </w:rPr>
   </w:style>
-  <w:style w:type="paragraph" w:styleId="2">
+  <w:style w:type="paragraph" w:styleId="Heading2">
     <w:name w:val="heading 2"/>
-    <w:basedOn w:val="a"/>
-    <w:next w:val="a"/>
-    <w:link w:val="2Char"/>
+    <w:basedOn w:val="Normal"/>
+    <w:next w:val="Normal"/>
+    <w:link w:val="Heading2Char"/>
     <w:uiPriority w:val="9"/>
     <w:semiHidden/>
     <w:unhideWhenUsed/>
@@ -7373,11 +7449,11 @@
       <w:szCs w:val="32"/>
     </w:rPr>
   </w:style>
-  <w:style w:type="paragraph" w:styleId="3">
+  <w:style w:type="paragraph" w:styleId="Heading3">
     <w:name w:val="heading 3"/>
-    <w:basedOn w:val="a"/>
-    <w:next w:val="a"/>
-    <w:link w:val="3Char"/>
+    <w:basedOn w:val="Normal"/>
+    <w:next w:val="Normal"/>
+    <w:link w:val="Heading3Char"/>
     <w:uiPriority w:val="9"/>
     <w:semiHidden/>
     <w:unhideWhenUsed/>
@@ -7396,11 +7472,11 @@
       <w:szCs w:val="28"/>
     </w:rPr>
   </w:style>
-  <w:style w:type="paragraph" w:styleId="4">
+  <w:style w:type="paragraph" w:styleId="Heading4">
     <w:name w:val="heading 4"/>
-    <w:basedOn w:val="a"/>
-    <w:next w:val="a"/>
-    <w:link w:val="4Char"/>
+    <w:basedOn w:val="Normal"/>
+    <w:next w:val="Normal"/>
+    <w:link w:val="Heading4Char"/>
     <w:uiPriority w:val="9"/>
     <w:semiHidden/>
     <w:unhideWhenUsed/>
@@ -7419,11 +7495,11 @@
       <w:color w:val="0F4761" w:themeColor="accent1" w:themeShade="BF"/>
     </w:rPr>
   </w:style>
-  <w:style w:type="paragraph" w:styleId="5">
+  <w:style w:type="paragraph" w:styleId="Heading5">
     <w:name w:val="heading 5"/>
-    <w:basedOn w:val="a"/>
-    <w:next w:val="a"/>
-    <w:link w:val="5Char"/>
+    <w:basedOn w:val="Normal"/>
+    <w:next w:val="Normal"/>
+    <w:link w:val="Heading5Char"/>
     <w:uiPriority w:val="9"/>
     <w:semiHidden/>
     <w:unhideWhenUsed/>
@@ -7440,11 +7516,11 @@
       <w:color w:val="0F4761" w:themeColor="accent1" w:themeShade="BF"/>
     </w:rPr>
   </w:style>
-  <w:style w:type="paragraph" w:styleId="6">
+  <w:style w:type="paragraph" w:styleId="Heading6">
     <w:name w:val="heading 6"/>
-    <w:basedOn w:val="a"/>
-    <w:next w:val="a"/>
-    <w:link w:val="6Char"/>
+    <w:basedOn w:val="Normal"/>
+    <w:next w:val="Normal"/>
+    <w:link w:val="Heading6Char"/>
     <w:uiPriority w:val="9"/>
     <w:semiHidden/>
     <w:unhideWhenUsed/>
@@ -7463,11 +7539,11 @@
       <w:color w:val="595959" w:themeColor="text1" w:themeTint="A6"/>
     </w:rPr>
   </w:style>
-  <w:style w:type="paragraph" w:styleId="7">
+  <w:style w:type="paragraph" w:styleId="Heading7">
     <w:name w:val="heading 7"/>
-    <w:basedOn w:val="a"/>
-    <w:next w:val="a"/>
-    <w:link w:val="7Char"/>
+    <w:basedOn w:val="Normal"/>
+    <w:next w:val="Normal"/>
+    <w:link w:val="Heading7Char"/>
     <w:uiPriority w:val="9"/>
     <w:semiHidden/>
     <w:unhideWhenUsed/>
@@ -7484,11 +7560,11 @@
       <w:color w:val="595959" w:themeColor="text1" w:themeTint="A6"/>
     </w:rPr>
   </w:style>
-  <w:style w:type="paragraph" w:styleId="8">
+  <w:style w:type="paragraph" w:styleId="Heading8">
     <w:name w:val="heading 8"/>
-    <w:basedOn w:val="a"/>
-    <w:next w:val="a"/>
-    <w:link w:val="8Char"/>
+    <w:basedOn w:val="Normal"/>
+    <w:next w:val="Normal"/>
+    <w:link w:val="Heading8Char"/>
     <w:uiPriority w:val="9"/>
     <w:semiHidden/>
     <w:unhideWhenUsed/>
@@ -7507,11 +7583,11 @@
       <w:color w:val="272727" w:themeColor="text1" w:themeTint="D8"/>
     </w:rPr>
   </w:style>
-  <w:style w:type="paragraph" w:styleId="9">
+  <w:style w:type="paragraph" w:styleId="Heading9">
     <w:name w:val="heading 9"/>
-    <w:basedOn w:val="a"/>
-    <w:next w:val="a"/>
-    <w:link w:val="9Char"/>
+    <w:basedOn w:val="Normal"/>
+    <w:next w:val="Normal"/>
+    <w:link w:val="Heading9Char"/>
     <w:uiPriority w:val="9"/>
     <w:semiHidden/>
     <w:unhideWhenUsed/>
@@ -7528,12 +7604,13 @@
       <w:color w:val="272727" w:themeColor="text1" w:themeTint="D8"/>
     </w:rPr>
   </w:style>
-  <w:style w:type="character" w:default="1" w:styleId="a0">
+  <w:style w:type="character" w:default="1" w:styleId="DefaultParagraphFont">
     <w:name w:val="Default Paragraph Font"/>
     <w:uiPriority w:val="1"/>
+    <w:semiHidden/>
     <w:unhideWhenUsed/>
   </w:style>
-  <w:style w:type="table" w:default="1" w:styleId="a1">
+  <w:style w:type="table" w:default="1" w:styleId="TableNormal">
     <w:name w:val="Normal Table"/>
     <w:uiPriority w:val="99"/>
     <w:semiHidden/>
@@ -7548,16 +7625,16 @@
       </w:tblCellMar>
     </w:tblPr>
   </w:style>
-  <w:style w:type="numbering" w:default="1" w:styleId="a2">
+  <w:style w:type="numbering" w:default="1" w:styleId="NoList">
     <w:name w:val="No List"/>
     <w:uiPriority w:val="99"/>
     <w:semiHidden/>
     <w:unhideWhenUsed/>
   </w:style>
-  <w:style w:type="character" w:customStyle="1" w:styleId="1Char">
-    <w:name w:val="Επικεφαλίδα 1 Char"/>
-    <w:basedOn w:val="a0"/>
-    <w:link w:val="1"/>
+  <w:style w:type="character" w:customStyle="1" w:styleId="Heading1Char">
+    <w:name w:val="Heading 1 Char"/>
+    <w:basedOn w:val="DefaultParagraphFont"/>
+    <w:link w:val="Heading1"/>
     <w:uiPriority w:val="9"/>
     <w:rsid w:val="008E72A7"/>
     <w:rPr>
@@ -7567,10 +7644,10 @@
       <w:szCs w:val="40"/>
     </w:rPr>
   </w:style>
-  <w:style w:type="character" w:customStyle="1" w:styleId="2Char">
-    <w:name w:val="Επικεφαλίδα 2 Char"/>
-    <w:basedOn w:val="a0"/>
-    <w:link w:val="2"/>
+  <w:style w:type="character" w:customStyle="1" w:styleId="Heading2Char">
+    <w:name w:val="Heading 2 Char"/>
+    <w:basedOn w:val="DefaultParagraphFont"/>
+    <w:link w:val="Heading2"/>
     <w:uiPriority w:val="9"/>
     <w:semiHidden/>
     <w:rsid w:val="008E72A7"/>
@@ -7581,10 +7658,10 @@
       <w:szCs w:val="32"/>
     </w:rPr>
   </w:style>
-  <w:style w:type="character" w:customStyle="1" w:styleId="3Char">
-    <w:name w:val="Επικεφαλίδα 3 Char"/>
-    <w:basedOn w:val="a0"/>
-    <w:link w:val="3"/>
+  <w:style w:type="character" w:customStyle="1" w:styleId="Heading3Char">
+    <w:name w:val="Heading 3 Char"/>
+    <w:basedOn w:val="DefaultParagraphFont"/>
+    <w:link w:val="Heading3"/>
     <w:uiPriority w:val="9"/>
     <w:semiHidden/>
     <w:rsid w:val="008E72A7"/>
@@ -7595,10 +7672,10 @@
       <w:szCs w:val="28"/>
     </w:rPr>
   </w:style>
-  <w:style w:type="character" w:customStyle="1" w:styleId="4Char">
-    <w:name w:val="Επικεφαλίδα 4 Char"/>
-    <w:basedOn w:val="a0"/>
-    <w:link w:val="4"/>
+  <w:style w:type="character" w:customStyle="1" w:styleId="Heading4Char">
+    <w:name w:val="Heading 4 Char"/>
+    <w:basedOn w:val="DefaultParagraphFont"/>
+    <w:link w:val="Heading4"/>
     <w:uiPriority w:val="9"/>
     <w:semiHidden/>
     <w:rsid w:val="008E72A7"/>
@@ -7609,10 +7686,10 @@
       <w:color w:val="0F4761" w:themeColor="accent1" w:themeShade="BF"/>
     </w:rPr>
   </w:style>
-  <w:style w:type="character" w:customStyle="1" w:styleId="5Char">
-    <w:name w:val="Επικεφαλίδα 5 Char"/>
-    <w:basedOn w:val="a0"/>
-    <w:link w:val="5"/>
+  <w:style w:type="character" w:customStyle="1" w:styleId="Heading5Char">
+    <w:name w:val="Heading 5 Char"/>
+    <w:basedOn w:val="DefaultParagraphFont"/>
+    <w:link w:val="Heading5"/>
     <w:uiPriority w:val="9"/>
     <w:semiHidden/>
     <w:rsid w:val="008E72A7"/>
@@ -7621,10 +7698,10 @@
       <w:color w:val="0F4761" w:themeColor="accent1" w:themeShade="BF"/>
     </w:rPr>
   </w:style>
-  <w:style w:type="character" w:customStyle="1" w:styleId="6Char">
-    <w:name w:val="Επικεφαλίδα 6 Char"/>
-    <w:basedOn w:val="a0"/>
-    <w:link w:val="6"/>
+  <w:style w:type="character" w:customStyle="1" w:styleId="Heading6Char">
+    <w:name w:val="Heading 6 Char"/>
+    <w:basedOn w:val="DefaultParagraphFont"/>
+    <w:link w:val="Heading6"/>
     <w:uiPriority w:val="9"/>
     <w:semiHidden/>
     <w:rsid w:val="008E72A7"/>
@@ -7635,10 +7712,10 @@
       <w:color w:val="595959" w:themeColor="text1" w:themeTint="A6"/>
     </w:rPr>
   </w:style>
-  <w:style w:type="character" w:customStyle="1" w:styleId="7Char">
-    <w:name w:val="Επικεφαλίδα 7 Char"/>
-    <w:basedOn w:val="a0"/>
-    <w:link w:val="7"/>
+  <w:style w:type="character" w:customStyle="1" w:styleId="Heading7Char">
+    <w:name w:val="Heading 7 Char"/>
+    <w:basedOn w:val="DefaultParagraphFont"/>
+    <w:link w:val="Heading7"/>
     <w:uiPriority w:val="9"/>
     <w:semiHidden/>
     <w:rsid w:val="008E72A7"/>
@@ -7647,10 +7724,10 @@
       <w:color w:val="595959" w:themeColor="text1" w:themeTint="A6"/>
     </w:rPr>
   </w:style>
-  <w:style w:type="character" w:customStyle="1" w:styleId="8Char">
-    <w:name w:val="Επικεφαλίδα 8 Char"/>
-    <w:basedOn w:val="a0"/>
-    <w:link w:val="8"/>
+  <w:style w:type="character" w:customStyle="1" w:styleId="Heading8Char">
+    <w:name w:val="Heading 8 Char"/>
+    <w:basedOn w:val="DefaultParagraphFont"/>
+    <w:link w:val="Heading8"/>
     <w:uiPriority w:val="9"/>
     <w:semiHidden/>
     <w:rsid w:val="008E72A7"/>
@@ -7661,10 +7738,10 @@
       <w:color w:val="272727" w:themeColor="text1" w:themeTint="D8"/>
     </w:rPr>
   </w:style>
-  <w:style w:type="character" w:customStyle="1" w:styleId="9Char">
-    <w:name w:val="Επικεφαλίδα 9 Char"/>
-    <w:basedOn w:val="a0"/>
-    <w:link w:val="9"/>
+  <w:style w:type="character" w:customStyle="1" w:styleId="Heading9Char">
+    <w:name w:val="Heading 9 Char"/>
+    <w:basedOn w:val="DefaultParagraphFont"/>
+    <w:link w:val="Heading9"/>
     <w:uiPriority w:val="9"/>
     <w:semiHidden/>
     <w:rsid w:val="008E72A7"/>
@@ -7673,11 +7750,11 @@
       <w:color w:val="272727" w:themeColor="text1" w:themeTint="D8"/>
     </w:rPr>
   </w:style>
-  <w:style w:type="paragraph" w:styleId="a3">
+  <w:style w:type="paragraph" w:styleId="Title">
     <w:name w:val="Title"/>
-    <w:basedOn w:val="a"/>
-    <w:next w:val="a"/>
-    <w:link w:val="Char"/>
+    <w:basedOn w:val="Normal"/>
+    <w:next w:val="Normal"/>
+    <w:link w:val="TitleChar"/>
     <w:uiPriority w:val="10"/>
     <w:qFormat/>
     <w:rsid w:val="008E72A7"/>
@@ -7693,10 +7770,10 @@
       <w:szCs w:val="56"/>
     </w:rPr>
   </w:style>
-  <w:style w:type="character" w:customStyle="1" w:styleId="Char">
-    <w:name w:val="Τίτλος Char"/>
-    <w:basedOn w:val="a0"/>
-    <w:link w:val="a3"/>
+  <w:style w:type="character" w:customStyle="1" w:styleId="TitleChar">
+    <w:name w:val="Title Char"/>
+    <w:basedOn w:val="DefaultParagraphFont"/>
+    <w:link w:val="Title"/>
     <w:uiPriority w:val="10"/>
     <w:rsid w:val="008E72A7"/>
     <w:rPr>
@@ -7707,11 +7784,11 @@
       <w:szCs w:val="56"/>
     </w:rPr>
   </w:style>
-  <w:style w:type="paragraph" w:styleId="a4">
+  <w:style w:type="paragraph" w:styleId="Subtitle">
     <w:name w:val="Subtitle"/>
-    <w:basedOn w:val="a"/>
-    <w:next w:val="a"/>
-    <w:link w:val="Char0"/>
+    <w:basedOn w:val="Normal"/>
+    <w:next w:val="Normal"/>
+    <w:link w:val="SubtitleChar"/>
     <w:uiPriority w:val="11"/>
     <w:qFormat/>
     <w:rsid w:val="008E72A7"/>
@@ -7728,10 +7805,10 @@
       <w:szCs w:val="28"/>
     </w:rPr>
   </w:style>
-  <w:style w:type="character" w:customStyle="1" w:styleId="Char0">
-    <w:name w:val="Υπότιτλος Char"/>
-    <w:basedOn w:val="a0"/>
-    <w:link w:val="a4"/>
+  <w:style w:type="character" w:customStyle="1" w:styleId="SubtitleChar">
+    <w:name w:val="Subtitle Char"/>
+    <w:basedOn w:val="DefaultParagraphFont"/>
+    <w:link w:val="Subtitle"/>
     <w:uiPriority w:val="11"/>
     <w:rsid w:val="008E72A7"/>
     <w:rPr>
@@ -7742,11 +7819,11 @@
       <w:szCs w:val="28"/>
     </w:rPr>
   </w:style>
-  <w:style w:type="paragraph" w:styleId="a5">
+  <w:style w:type="paragraph" w:styleId="Quote">
     <w:name w:val="Quote"/>
-    <w:basedOn w:val="a"/>
-    <w:next w:val="a"/>
-    <w:link w:val="Char1"/>
+    <w:basedOn w:val="Normal"/>
+    <w:next w:val="Normal"/>
+    <w:link w:val="QuoteChar"/>
     <w:uiPriority w:val="29"/>
     <w:qFormat/>
     <w:rsid w:val="008E72A7"/>
@@ -7760,10 +7837,10 @@
       <w:color w:val="404040" w:themeColor="text1" w:themeTint="BF"/>
     </w:rPr>
   </w:style>
-  <w:style w:type="character" w:customStyle="1" w:styleId="Char1">
-    <w:name w:val="Απόσπασμα Char"/>
-    <w:basedOn w:val="a0"/>
-    <w:link w:val="a5"/>
+  <w:style w:type="character" w:customStyle="1" w:styleId="QuoteChar">
+    <w:name w:val="Quote Char"/>
+    <w:basedOn w:val="DefaultParagraphFont"/>
+    <w:link w:val="Quote"/>
     <w:uiPriority w:val="29"/>
     <w:rsid w:val="008E72A7"/>
     <w:rPr>
@@ -7772,9 +7849,9 @@
       <w:color w:val="404040" w:themeColor="text1" w:themeTint="BF"/>
     </w:rPr>
   </w:style>
-  <w:style w:type="paragraph" w:styleId="a6">
+  <w:style w:type="paragraph" w:styleId="ListParagraph">
     <w:name w:val="List Paragraph"/>
-    <w:basedOn w:val="a"/>
+    <w:basedOn w:val="Normal"/>
     <w:uiPriority w:val="34"/>
     <w:qFormat/>
     <w:rsid w:val="008E72A7"/>
@@ -7783,9 +7860,9 @@
       <w:contextualSpacing/>
     </w:pPr>
   </w:style>
-  <w:style w:type="character" w:styleId="a7">
+  <w:style w:type="character" w:styleId="IntenseEmphasis">
     <w:name w:val="Intense Emphasis"/>
-    <w:basedOn w:val="a0"/>
+    <w:basedOn w:val="DefaultParagraphFont"/>
     <w:uiPriority w:val="21"/>
     <w:qFormat/>
     <w:rsid w:val="008E72A7"/>
@@ -7795,11 +7872,11 @@
       <w:color w:val="0F4761" w:themeColor="accent1" w:themeShade="BF"/>
     </w:rPr>
   </w:style>
-  <w:style w:type="paragraph" w:styleId="a8">
+  <w:style w:type="paragraph" w:styleId="IntenseQuote">
     <w:name w:val="Intense Quote"/>
-    <w:basedOn w:val="a"/>
-    <w:next w:val="a"/>
-    <w:link w:val="Char2"/>
+    <w:basedOn w:val="Normal"/>
+    <w:next w:val="Normal"/>
+    <w:link w:val="IntenseQuoteChar"/>
     <w:uiPriority w:val="30"/>
     <w:qFormat/>
     <w:rsid w:val="008E72A7"/>
@@ -7818,10 +7895,10 @@
       <w:color w:val="0F4761" w:themeColor="accent1" w:themeShade="BF"/>
     </w:rPr>
   </w:style>
-  <w:style w:type="character" w:customStyle="1" w:styleId="Char2">
-    <w:name w:val="Έντονο απόσπ. Char"/>
-    <w:basedOn w:val="a0"/>
-    <w:link w:val="a8"/>
+  <w:style w:type="character" w:customStyle="1" w:styleId="IntenseQuoteChar">
+    <w:name w:val="Intense Quote Char"/>
+    <w:basedOn w:val="DefaultParagraphFont"/>
+    <w:link w:val="IntenseQuote"/>
     <w:uiPriority w:val="30"/>
     <w:rsid w:val="008E72A7"/>
     <w:rPr>
@@ -7830,9 +7907,9 @@
       <w:color w:val="0F4761" w:themeColor="accent1" w:themeShade="BF"/>
     </w:rPr>
   </w:style>
-  <w:style w:type="character" w:styleId="a9">
+  <w:style w:type="character" w:styleId="IntenseReference">
     <w:name w:val="Intense Reference"/>
-    <w:basedOn w:val="a0"/>
+    <w:basedOn w:val="DefaultParagraphFont"/>
     <w:uiPriority w:val="32"/>
     <w:qFormat/>
     <w:rsid w:val="008E72A7"/>
@@ -7844,9 +7921,9 @@
       <w:spacing w:val="5"/>
     </w:rPr>
   </w:style>
-  <w:style w:type="character" w:styleId="-">
+  <w:style w:type="character" w:styleId="Hyperlink">
     <w:name w:val="Hyperlink"/>
-    <w:basedOn w:val="a0"/>
+    <w:basedOn w:val="DefaultParagraphFont"/>
     <w:uiPriority w:val="99"/>
     <w:unhideWhenUsed/>
     <w:rsid w:val="00D84C91"/>
@@ -7855,9 +7932,9 @@
       <w:u w:val="single"/>
     </w:rPr>
   </w:style>
-  <w:style w:type="character" w:styleId="aa">
+  <w:style w:type="character" w:styleId="UnresolvedMention">
     <w:name w:val="Unresolved Mention"/>
-    <w:basedOn w:val="a0"/>
+    <w:basedOn w:val="DefaultParagraphFont"/>
     <w:uiPriority w:val="99"/>
     <w:semiHidden/>
     <w:unhideWhenUsed/>
@@ -7867,9 +7944,9 @@
       <w:shd w:val="clear" w:color="auto" w:fill="E1DFDD"/>
     </w:rPr>
   </w:style>
-  <w:style w:type="paragraph" w:styleId="Web">
+  <w:style w:type="paragraph" w:styleId="NormalWeb">
     <w:name w:val="Normal (Web)"/>
-    <w:basedOn w:val="a"/>
+    <w:basedOn w:val="Normal"/>
     <w:uiPriority w:val="99"/>
     <w:semiHidden/>
     <w:unhideWhenUsed/>
@@ -7878,9 +7955,9 @@
       <w:rFonts w:ascii="Times New Roman" w:hAnsi="Times New Roman" w:cs="Times New Roman"/>
     </w:rPr>
   </w:style>
-  <w:style w:type="character" w:styleId="-0">
+  <w:style w:type="character" w:styleId="FollowedHyperlink">
     <w:name w:val="FollowedHyperlink"/>
-    <w:basedOn w:val="a0"/>
+    <w:basedOn w:val="DefaultParagraphFont"/>
     <w:uiPriority w:val="99"/>
     <w:semiHidden/>
     <w:unhideWhenUsed/>

</xml_diff>